<commit_message>
Report: fix Table 3 decision-time means (weighted 283.1; Sprintlink 155.5; Tiscali 4,340.4) to match full-eval timing; stop Table 2 rows splitting across pages and widen Rows column
</commit_message>
<xml_diff>
--- a/STUDENT_PROFESSOR_FINAL_REPORT.docx
+++ b/STUDENT_PROFESSOR_FINAL_REPORT.docx
@@ -1940,14 +1940,14 @@
       </w:tblPr>
       <w:tblGrid>
         <w:gridCol w:w="1120"/>
-        <w:gridCol w:w="560"/>
+        <w:gridCol w:w="760"/>
         <w:gridCol w:w="800"/>
         <w:gridCol w:w="860"/>
         <w:gridCol w:w="560"/>
         <w:gridCol w:w="680"/>
         <w:gridCol w:w="820"/>
         <w:gridCol w:w="560"/>
-        <w:gridCol w:w="2120"/>
+        <w:gridCol w:w="1920"/>
         <w:gridCol w:w="720"/>
         <w:gridCol w:w="640"/>
         <w:gridCol w:w="640"/>
@@ -1955,6 +1955,7 @@
       <w:tr>
         <w:trPr>
           <w:tblHeader/>
+          <w:cantSplit/>
         </w:trPr>
         <w:tc>
           <w:tcPr>
@@ -1993,7 +1994,7 @@
         </w:tc>
         <w:tc>
           <w:tcPr>
-            <w:tcW w:type="dxa" w:w="560"/>
+            <w:tcW w:type="dxa" w:w="760"/>
             <w:tcBorders>
               <w:top w:val="single" w:color="CCCCCC" w:sz="1"/>
               <w:left w:val="single" w:color="CCCCCC" w:sz="1"/>
@@ -2238,7 +2239,7 @@
         </w:tc>
         <w:tc>
           <w:tcPr>
-            <w:tcW w:type="dxa" w:w="2120"/>
+            <w:tcW w:type="dxa" w:w="1920"/>
             <w:tcBorders>
               <w:top w:val="single" w:color="CCCCCC" w:sz="1"/>
               <w:left w:val="single" w:color="CCCCCC" w:sz="1"/>
@@ -2378,6 +2379,9 @@
         </w:tc>
       </w:tr>
       <w:tr>
+        <w:trPr>
+          <w:cantSplit/>
+        </w:trPr>
         <w:tc>
           <w:tcPr>
             <w:tcW w:type="dxa" w:w="1120"/>
@@ -2410,6 +2414,96 @@
         </w:tc>
         <w:tc>
           <w:tcPr>
+            <w:tcW w:type="dxa" w:w="760"/>
+            <w:tcBorders>
+              <w:top w:val="single" w:color="CCCCCC" w:sz="1"/>
+              <w:left w:val="single" w:color="CCCCCC" w:sz="1"/>
+              <w:bottom w:val="single" w:color="CCCCCC" w:sz="1"/>
+              <w:right w:val="single" w:color="CCCCCC" w:sz="1"/>
+            </w:tcBorders>
+            <w:tcMar>
+              <w:top w:type="dxa" w:w="60"/>
+              <w:left w:type="dxa" w:w="100"/>
+              <w:bottom w:type="dxa" w:w="60"/>
+              <w:right w:type="dxa" w:w="100"/>
+            </w:tcMar>
+            <w:vAlign w:val="center"/>
+          </w:tcPr>
+          <w:p>
+            <w:r>
+              <w:rPr>
+                <w:rFonts w:ascii="Arial" w:cs="Arial" w:eastAsia="Arial" w:hAnsi="Arial"/>
+                <w:b w:val="false"/>
+                <w:bCs w:val="false"/>
+                <w:sz w:val="15"/>
+                <w:szCs w:val="15"/>
+              </w:rPr>
+              <w:t xml:space="preserve">2,016</w:t>
+            </w:r>
+          </w:p>
+        </w:tc>
+        <w:tc>
+          <w:tcPr>
+            <w:tcW w:type="dxa" w:w="800"/>
+            <w:tcBorders>
+              <w:top w:val="single" w:color="CCCCCC" w:sz="1"/>
+              <w:left w:val="single" w:color="CCCCCC" w:sz="1"/>
+              <w:bottom w:val="single" w:color="CCCCCC" w:sz="1"/>
+              <w:right w:val="single" w:color="CCCCCC" w:sz="1"/>
+            </w:tcBorders>
+            <w:tcMar>
+              <w:top w:type="dxa" w:w="60"/>
+              <w:left w:type="dxa" w:w="100"/>
+              <w:bottom w:type="dxa" w:w="60"/>
+              <w:right w:type="dxa" w:w="100"/>
+            </w:tcMar>
+            <w:vAlign w:val="center"/>
+          </w:tcPr>
+          <w:p>
+            <w:r>
+              <w:rPr>
+                <w:rFonts w:ascii="Arial" w:cs="Arial" w:eastAsia="Arial" w:hAnsi="Arial"/>
+                <w:b w:val="false"/>
+                <w:bCs w:val="false"/>
+                <w:sz w:val="15"/>
+                <w:szCs w:val="15"/>
+              </w:rPr>
+              <w:t xml:space="preserve">99.669%</w:t>
+            </w:r>
+          </w:p>
+        </w:tc>
+        <w:tc>
+          <w:tcPr>
+            <w:tcW w:type="dxa" w:w="860"/>
+            <w:tcBorders>
+              <w:top w:val="single" w:color="CCCCCC" w:sz="1"/>
+              <w:left w:val="single" w:color="CCCCCC" w:sz="1"/>
+              <w:bottom w:val="single" w:color="CCCCCC" w:sz="1"/>
+              <w:right w:val="single" w:color="CCCCCC" w:sz="1"/>
+            </w:tcBorders>
+            <w:tcMar>
+              <w:top w:type="dxa" w:w="60"/>
+              <w:left w:type="dxa" w:w="100"/>
+              <w:bottom w:type="dxa" w:w="60"/>
+              <w:right w:type="dxa" w:w="100"/>
+            </w:tcMar>
+            <w:vAlign w:val="center"/>
+          </w:tcPr>
+          <w:p>
+            <w:r>
+              <w:rPr>
+                <w:rFonts w:ascii="Arial" w:cs="Arial" w:eastAsia="Arial" w:hAnsi="Arial"/>
+                <w:b w:val="false"/>
+                <w:bCs w:val="false"/>
+                <w:sz w:val="15"/>
+                <w:szCs w:val="15"/>
+              </w:rPr>
+              <w:t xml:space="preserve">95.800%</w:t>
+            </w:r>
+          </w:p>
+        </w:tc>
+        <w:tc>
+          <w:tcPr>
             <w:tcW w:type="dxa" w:w="560"/>
             <w:tcBorders>
               <w:top w:val="single" w:color="CCCCCC" w:sz="1"/>
@@ -2434,67 +2528,67 @@
                 <w:sz w:val="15"/>
                 <w:szCs w:val="15"/>
               </w:rPr>
-              <w:t xml:space="preserve">2,016</w:t>
-            </w:r>
-          </w:p>
-        </w:tc>
-        <w:tc>
-          <w:tcPr>
-            <w:tcW w:type="dxa" w:w="800"/>
-            <w:tcBorders>
-              <w:top w:val="single" w:color="CCCCCC" w:sz="1"/>
-              <w:left w:val="single" w:color="CCCCCC" w:sz="1"/>
-              <w:bottom w:val="single" w:color="CCCCCC" w:sz="1"/>
-              <w:right w:val="single" w:color="CCCCCC" w:sz="1"/>
-            </w:tcBorders>
-            <w:tcMar>
-              <w:top w:type="dxa" w:w="60"/>
-              <w:left w:type="dxa" w:w="100"/>
-              <w:bottom w:type="dxa" w:w="60"/>
-              <w:right w:type="dxa" w:w="100"/>
-            </w:tcMar>
-            <w:vAlign w:val="center"/>
-          </w:tcPr>
-          <w:p>
-            <w:r>
-              <w:rPr>
-                <w:rFonts w:ascii="Arial" w:cs="Arial" w:eastAsia="Arial" w:hAnsi="Arial"/>
-                <w:b w:val="false"/>
-                <w:bCs w:val="false"/>
-                <w:sz w:val="15"/>
-                <w:szCs w:val="15"/>
-              </w:rPr>
-              <w:t xml:space="preserve">99.669%</w:t>
-            </w:r>
-          </w:p>
-        </w:tc>
-        <w:tc>
-          <w:tcPr>
-            <w:tcW w:type="dxa" w:w="860"/>
-            <w:tcBorders>
-              <w:top w:val="single" w:color="CCCCCC" w:sz="1"/>
-              <w:left w:val="single" w:color="CCCCCC" w:sz="1"/>
-              <w:bottom w:val="single" w:color="CCCCCC" w:sz="1"/>
-              <w:right w:val="single" w:color="CCCCCC" w:sz="1"/>
-            </w:tcBorders>
-            <w:tcMar>
-              <w:top w:type="dxa" w:w="60"/>
-              <w:left w:type="dxa" w:w="100"/>
-              <w:bottom w:type="dxa" w:w="60"/>
-              <w:right w:type="dxa" w:w="100"/>
-            </w:tcMar>
-            <w:vAlign w:val="center"/>
-          </w:tcPr>
-          <w:p>
-            <w:r>
-              <w:rPr>
-                <w:rFonts w:ascii="Arial" w:cs="Arial" w:eastAsia="Arial" w:hAnsi="Arial"/>
-                <w:b w:val="false"/>
-                <w:bCs w:val="false"/>
-                <w:sz w:val="15"/>
-                <w:szCs w:val="15"/>
-              </w:rPr>
-              <w:t xml:space="preserve">95.800%</w:t>
+              <w:t xml:space="preserve">WIN</w:t>
+            </w:r>
+          </w:p>
+        </w:tc>
+        <w:tc>
+          <w:tcPr>
+            <w:tcW w:type="dxa" w:w="680"/>
+            <w:tcBorders>
+              <w:top w:val="single" w:color="CCCCCC" w:sz="1"/>
+              <w:left w:val="single" w:color="CCCCCC" w:sz="1"/>
+              <w:bottom w:val="single" w:color="CCCCCC" w:sz="1"/>
+              <w:right w:val="single" w:color="CCCCCC" w:sz="1"/>
+            </w:tcBorders>
+            <w:tcMar>
+              <w:top w:type="dxa" w:w="60"/>
+              <w:left w:type="dxa" w:w="100"/>
+              <w:bottom w:type="dxa" w:w="60"/>
+              <w:right w:type="dxa" w:w="100"/>
+            </w:tcMar>
+            <w:vAlign w:val="center"/>
+          </w:tcPr>
+          <w:p>
+            <w:r>
+              <w:rPr>
+                <w:rFonts w:ascii="Arial" w:cs="Arial" w:eastAsia="Arial" w:hAnsi="Arial"/>
+                <w:b w:val="false"/>
+                <w:bCs w:val="false"/>
+                <w:sz w:val="15"/>
+                <w:szCs w:val="15"/>
+              </w:rPr>
+              <w:t xml:space="preserve">0.613%</w:t>
+            </w:r>
+          </w:p>
+        </w:tc>
+        <w:tc>
+          <w:tcPr>
+            <w:tcW w:type="dxa" w:w="820"/>
+            <w:tcBorders>
+              <w:top w:val="single" w:color="CCCCCC" w:sz="1"/>
+              <w:left w:val="single" w:color="CCCCCC" w:sz="1"/>
+              <w:bottom w:val="single" w:color="CCCCCC" w:sz="1"/>
+              <w:right w:val="single" w:color="CCCCCC" w:sz="1"/>
+            </w:tcBorders>
+            <w:tcMar>
+              <w:top w:type="dxa" w:w="60"/>
+              <w:left w:type="dxa" w:w="100"/>
+              <w:bottom w:type="dxa" w:w="60"/>
+              <w:right w:type="dxa" w:w="100"/>
+            </w:tcMar>
+            <w:vAlign w:val="center"/>
+          </w:tcPr>
+          <w:p>
+            <w:r>
+              <w:rPr>
+                <w:rFonts w:ascii="Arial" w:cs="Arial" w:eastAsia="Arial" w:hAnsi="Arial"/>
+                <w:b w:val="false"/>
+                <w:bCs w:val="false"/>
+                <w:sz w:val="15"/>
+                <w:szCs w:val="15"/>
+              </w:rPr>
+              <w:t xml:space="preserve">5.130%</w:t>
             </w:r>
           </w:p>
         </w:tc>
@@ -2530,97 +2624,7 @@
         </w:tc>
         <w:tc>
           <w:tcPr>
-            <w:tcW w:type="dxa" w:w="680"/>
-            <w:tcBorders>
-              <w:top w:val="single" w:color="CCCCCC" w:sz="1"/>
-              <w:left w:val="single" w:color="CCCCCC" w:sz="1"/>
-              <w:bottom w:val="single" w:color="CCCCCC" w:sz="1"/>
-              <w:right w:val="single" w:color="CCCCCC" w:sz="1"/>
-            </w:tcBorders>
-            <w:tcMar>
-              <w:top w:type="dxa" w:w="60"/>
-              <w:left w:type="dxa" w:w="100"/>
-              <w:bottom w:type="dxa" w:w="60"/>
-              <w:right w:type="dxa" w:w="100"/>
-            </w:tcMar>
-            <w:vAlign w:val="center"/>
-          </w:tcPr>
-          <w:p>
-            <w:r>
-              <w:rPr>
-                <w:rFonts w:ascii="Arial" w:cs="Arial" w:eastAsia="Arial" w:hAnsi="Arial"/>
-                <w:b w:val="false"/>
-                <w:bCs w:val="false"/>
-                <w:sz w:val="15"/>
-                <w:szCs w:val="15"/>
-              </w:rPr>
-              <w:t xml:space="preserve">0.613%</w:t>
-            </w:r>
-          </w:p>
-        </w:tc>
-        <w:tc>
-          <w:tcPr>
-            <w:tcW w:type="dxa" w:w="820"/>
-            <w:tcBorders>
-              <w:top w:val="single" w:color="CCCCCC" w:sz="1"/>
-              <w:left w:val="single" w:color="CCCCCC" w:sz="1"/>
-              <w:bottom w:val="single" w:color="CCCCCC" w:sz="1"/>
-              <w:right w:val="single" w:color="CCCCCC" w:sz="1"/>
-            </w:tcBorders>
-            <w:tcMar>
-              <w:top w:type="dxa" w:w="60"/>
-              <w:left w:type="dxa" w:w="100"/>
-              <w:bottom w:type="dxa" w:w="60"/>
-              <w:right w:type="dxa" w:w="100"/>
-            </w:tcMar>
-            <w:vAlign w:val="center"/>
-          </w:tcPr>
-          <w:p>
-            <w:r>
-              <w:rPr>
-                <w:rFonts w:ascii="Arial" w:cs="Arial" w:eastAsia="Arial" w:hAnsi="Arial"/>
-                <w:b w:val="false"/>
-                <w:bCs w:val="false"/>
-                <w:sz w:val="15"/>
-                <w:szCs w:val="15"/>
-              </w:rPr>
-              <w:t xml:space="preserve">5.130%</w:t>
-            </w:r>
-          </w:p>
-        </w:tc>
-        <w:tc>
-          <w:tcPr>
-            <w:tcW w:type="dxa" w:w="560"/>
-            <w:tcBorders>
-              <w:top w:val="single" w:color="CCCCCC" w:sz="1"/>
-              <w:left w:val="single" w:color="CCCCCC" w:sz="1"/>
-              <w:bottom w:val="single" w:color="CCCCCC" w:sz="1"/>
-              <w:right w:val="single" w:color="CCCCCC" w:sz="1"/>
-            </w:tcBorders>
-            <w:tcMar>
-              <w:top w:type="dxa" w:w="60"/>
-              <w:left w:type="dxa" w:w="100"/>
-              <w:bottom w:type="dxa" w:w="60"/>
-              <w:right w:type="dxa" w:w="100"/>
-            </w:tcMar>
-            <w:vAlign w:val="center"/>
-          </w:tcPr>
-          <w:p>
-            <w:r>
-              <w:rPr>
-                <w:rFonts w:ascii="Arial" w:cs="Arial" w:eastAsia="Arial" w:hAnsi="Arial"/>
-                <w:b w:val="false"/>
-                <w:bCs w:val="false"/>
-                <w:sz w:val="15"/>
-                <w:szCs w:val="15"/>
-              </w:rPr>
-              <w:t xml:space="preserve">WIN</w:t>
-            </w:r>
-          </w:p>
-        </w:tc>
-        <w:tc>
-          <w:tcPr>
-            <w:tcW w:type="dxa" w:w="2120"/>
+            <w:tcW w:type="dxa" w:w="1920"/>
             <w:tcBorders>
               <w:top w:val="single" w:color="CCCCCC" w:sz="1"/>
               <w:left w:val="single" w:color="CCCCCC" w:sz="1"/>
@@ -2740,6 +2744,9 @@
         </w:tc>
       </w:tr>
       <w:tr>
+        <w:trPr>
+          <w:cantSplit/>
+        </w:trPr>
         <w:tc>
           <w:tcPr>
             <w:tcW w:type="dxa" w:w="1120"/>
@@ -2773,6 +2780,99 @@
         </w:tc>
         <w:tc>
           <w:tcPr>
+            <w:tcW w:type="dxa" w:w="760"/>
+            <w:tcBorders>
+              <w:top w:val="single" w:color="CCCCCC" w:sz="1"/>
+              <w:left w:val="single" w:color="CCCCCC" w:sz="1"/>
+              <w:bottom w:val="single" w:color="CCCCCC" w:sz="1"/>
+              <w:right w:val="single" w:color="CCCCCC" w:sz="1"/>
+            </w:tcBorders>
+            <w:shd w:fill="F2F9FF" w:val="clear"/>
+            <w:tcMar>
+              <w:top w:type="dxa" w:w="60"/>
+              <w:left w:type="dxa" w:w="100"/>
+              <w:bottom w:type="dxa" w:w="60"/>
+              <w:right w:type="dxa" w:w="100"/>
+            </w:tcMar>
+            <w:vAlign w:val="center"/>
+          </w:tcPr>
+          <w:p>
+            <w:r>
+              <w:rPr>
+                <w:rFonts w:ascii="Arial" w:cs="Arial" w:eastAsia="Arial" w:hAnsi="Arial"/>
+                <w:b w:val="false"/>
+                <w:bCs w:val="false"/>
+                <w:sz w:val="15"/>
+                <w:szCs w:val="15"/>
+              </w:rPr>
+              <w:t xml:space="preserve">200</w:t>
+            </w:r>
+          </w:p>
+        </w:tc>
+        <w:tc>
+          <w:tcPr>
+            <w:tcW w:type="dxa" w:w="800"/>
+            <w:tcBorders>
+              <w:top w:val="single" w:color="CCCCCC" w:sz="1"/>
+              <w:left w:val="single" w:color="CCCCCC" w:sz="1"/>
+              <w:bottom w:val="single" w:color="CCCCCC" w:sz="1"/>
+              <w:right w:val="single" w:color="CCCCCC" w:sz="1"/>
+            </w:tcBorders>
+            <w:shd w:fill="F2F9FF" w:val="clear"/>
+            <w:tcMar>
+              <w:top w:type="dxa" w:w="60"/>
+              <w:left w:type="dxa" w:w="100"/>
+              <w:bottom w:type="dxa" w:w="60"/>
+              <w:right w:type="dxa" w:w="100"/>
+            </w:tcMar>
+            <w:vAlign w:val="center"/>
+          </w:tcPr>
+          <w:p>
+            <w:r>
+              <w:rPr>
+                <w:rFonts w:ascii="Arial" w:cs="Arial" w:eastAsia="Arial" w:hAnsi="Arial"/>
+                <w:b w:val="false"/>
+                <w:bCs w:val="false"/>
+                <w:sz w:val="15"/>
+                <w:szCs w:val="15"/>
+              </w:rPr>
+              <w:t xml:space="preserve">99.420%</w:t>
+            </w:r>
+          </w:p>
+        </w:tc>
+        <w:tc>
+          <w:tcPr>
+            <w:tcW w:type="dxa" w:w="860"/>
+            <w:tcBorders>
+              <w:top w:val="single" w:color="CCCCCC" w:sz="1"/>
+              <w:left w:val="single" w:color="CCCCCC" w:sz="1"/>
+              <w:bottom w:val="single" w:color="CCCCCC" w:sz="1"/>
+              <w:right w:val="single" w:color="CCCCCC" w:sz="1"/>
+            </w:tcBorders>
+            <w:shd w:fill="F2F9FF" w:val="clear"/>
+            <w:tcMar>
+              <w:top w:type="dxa" w:w="60"/>
+              <w:left w:type="dxa" w:w="100"/>
+              <w:bottom w:type="dxa" w:w="60"/>
+              <w:right w:type="dxa" w:w="100"/>
+            </w:tcMar>
+            <w:vAlign w:val="center"/>
+          </w:tcPr>
+          <w:p>
+            <w:r>
+              <w:rPr>
+                <w:rFonts w:ascii="Arial" w:cs="Arial" w:eastAsia="Arial" w:hAnsi="Arial"/>
+                <w:b w:val="false"/>
+                <w:bCs w:val="false"/>
+                <w:sz w:val="15"/>
+                <w:szCs w:val="15"/>
+              </w:rPr>
+              <w:t xml:space="preserve">97.500%</w:t>
+            </w:r>
+          </w:p>
+        </w:tc>
+        <w:tc>
+          <w:tcPr>
             <w:tcW w:type="dxa" w:w="560"/>
             <w:tcBorders>
               <w:top w:val="single" w:color="CCCCCC" w:sz="1"/>
@@ -2798,69 +2898,69 @@
                 <w:sz w:val="15"/>
                 <w:szCs w:val="15"/>
               </w:rPr>
-              <w:t xml:space="preserve">200</w:t>
-            </w:r>
-          </w:p>
-        </w:tc>
-        <w:tc>
-          <w:tcPr>
-            <w:tcW w:type="dxa" w:w="800"/>
-            <w:tcBorders>
-              <w:top w:val="single" w:color="CCCCCC" w:sz="1"/>
-              <w:left w:val="single" w:color="CCCCCC" w:sz="1"/>
-              <w:bottom w:val="single" w:color="CCCCCC" w:sz="1"/>
-              <w:right w:val="single" w:color="CCCCCC" w:sz="1"/>
-            </w:tcBorders>
-            <w:shd w:fill="F2F9FF" w:val="clear"/>
-            <w:tcMar>
-              <w:top w:type="dxa" w:w="60"/>
-              <w:left w:type="dxa" w:w="100"/>
-              <w:bottom w:type="dxa" w:w="60"/>
-              <w:right w:type="dxa" w:w="100"/>
-            </w:tcMar>
-            <w:vAlign w:val="center"/>
-          </w:tcPr>
-          <w:p>
-            <w:r>
-              <w:rPr>
-                <w:rFonts w:ascii="Arial" w:cs="Arial" w:eastAsia="Arial" w:hAnsi="Arial"/>
-                <w:b w:val="false"/>
-                <w:bCs w:val="false"/>
-                <w:sz w:val="15"/>
-                <w:szCs w:val="15"/>
-              </w:rPr>
-              <w:t xml:space="preserve">99.420%</w:t>
-            </w:r>
-          </w:p>
-        </w:tc>
-        <w:tc>
-          <w:tcPr>
-            <w:tcW w:type="dxa" w:w="860"/>
-            <w:tcBorders>
-              <w:top w:val="single" w:color="CCCCCC" w:sz="1"/>
-              <w:left w:val="single" w:color="CCCCCC" w:sz="1"/>
-              <w:bottom w:val="single" w:color="CCCCCC" w:sz="1"/>
-              <w:right w:val="single" w:color="CCCCCC" w:sz="1"/>
-            </w:tcBorders>
-            <w:shd w:fill="F2F9FF" w:val="clear"/>
-            <w:tcMar>
-              <w:top w:type="dxa" w:w="60"/>
-              <w:left w:type="dxa" w:w="100"/>
-              <w:bottom w:type="dxa" w:w="60"/>
-              <w:right w:type="dxa" w:w="100"/>
-            </w:tcMar>
-            <w:vAlign w:val="center"/>
-          </w:tcPr>
-          <w:p>
-            <w:r>
-              <w:rPr>
-                <w:rFonts w:ascii="Arial" w:cs="Arial" w:eastAsia="Arial" w:hAnsi="Arial"/>
-                <w:b w:val="false"/>
-                <w:bCs w:val="false"/>
-                <w:sz w:val="15"/>
-                <w:szCs w:val="15"/>
-              </w:rPr>
-              <w:t xml:space="preserve">97.500%</w:t>
+              <w:t xml:space="preserve">WIN</w:t>
+            </w:r>
+          </w:p>
+        </w:tc>
+        <w:tc>
+          <w:tcPr>
+            <w:tcW w:type="dxa" w:w="680"/>
+            <w:tcBorders>
+              <w:top w:val="single" w:color="CCCCCC" w:sz="1"/>
+              <w:left w:val="single" w:color="CCCCCC" w:sz="1"/>
+              <w:bottom w:val="single" w:color="CCCCCC" w:sz="1"/>
+              <w:right w:val="single" w:color="CCCCCC" w:sz="1"/>
+            </w:tcBorders>
+            <w:shd w:fill="F2F9FF" w:val="clear"/>
+            <w:tcMar>
+              <w:top w:type="dxa" w:w="60"/>
+              <w:left w:type="dxa" w:w="100"/>
+              <w:bottom w:type="dxa" w:w="60"/>
+              <w:right w:type="dxa" w:w="100"/>
+            </w:tcMar>
+            <w:vAlign w:val="center"/>
+          </w:tcPr>
+          <w:p>
+            <w:r>
+              <w:rPr>
+                <w:rFonts w:ascii="Arial" w:cs="Arial" w:eastAsia="Arial" w:hAnsi="Arial"/>
+                <w:b w:val="false"/>
+                <w:bCs w:val="false"/>
+                <w:sz w:val="15"/>
+                <w:szCs w:val="15"/>
+              </w:rPr>
+              <w:t xml:space="preserve">0.321%</w:t>
+            </w:r>
+          </w:p>
+        </w:tc>
+        <w:tc>
+          <w:tcPr>
+            <w:tcW w:type="dxa" w:w="820"/>
+            <w:tcBorders>
+              <w:top w:val="single" w:color="CCCCCC" w:sz="1"/>
+              <w:left w:val="single" w:color="CCCCCC" w:sz="1"/>
+              <w:bottom w:val="single" w:color="CCCCCC" w:sz="1"/>
+              <w:right w:val="single" w:color="CCCCCC" w:sz="1"/>
+            </w:tcBorders>
+            <w:shd w:fill="F2F9FF" w:val="clear"/>
+            <w:tcMar>
+              <w:top w:type="dxa" w:w="60"/>
+              <w:left w:type="dxa" w:w="100"/>
+              <w:bottom w:type="dxa" w:w="60"/>
+              <w:right w:type="dxa" w:w="100"/>
+            </w:tcMar>
+            <w:vAlign w:val="center"/>
+          </w:tcPr>
+          <w:p>
+            <w:r>
+              <w:rPr>
+                <w:rFonts w:ascii="Arial" w:cs="Arial" w:eastAsia="Arial" w:hAnsi="Arial"/>
+                <w:b w:val="false"/>
+                <w:bCs w:val="false"/>
+                <w:sz w:val="15"/>
+                <w:szCs w:val="15"/>
+              </w:rPr>
+              <w:t xml:space="preserve">1.830%</w:t>
             </w:r>
           </w:p>
         </w:tc>
@@ -2897,100 +2997,7 @@
         </w:tc>
         <w:tc>
           <w:tcPr>
-            <w:tcW w:type="dxa" w:w="680"/>
-            <w:tcBorders>
-              <w:top w:val="single" w:color="CCCCCC" w:sz="1"/>
-              <w:left w:val="single" w:color="CCCCCC" w:sz="1"/>
-              <w:bottom w:val="single" w:color="CCCCCC" w:sz="1"/>
-              <w:right w:val="single" w:color="CCCCCC" w:sz="1"/>
-            </w:tcBorders>
-            <w:shd w:fill="F2F9FF" w:val="clear"/>
-            <w:tcMar>
-              <w:top w:type="dxa" w:w="60"/>
-              <w:left w:type="dxa" w:w="100"/>
-              <w:bottom w:type="dxa" w:w="60"/>
-              <w:right w:type="dxa" w:w="100"/>
-            </w:tcMar>
-            <w:vAlign w:val="center"/>
-          </w:tcPr>
-          <w:p>
-            <w:r>
-              <w:rPr>
-                <w:rFonts w:ascii="Arial" w:cs="Arial" w:eastAsia="Arial" w:hAnsi="Arial"/>
-                <w:b w:val="false"/>
-                <w:bCs w:val="false"/>
-                <w:sz w:val="15"/>
-                <w:szCs w:val="15"/>
-              </w:rPr>
-              <w:t xml:space="preserve">0.321%</w:t>
-            </w:r>
-          </w:p>
-        </w:tc>
-        <w:tc>
-          <w:tcPr>
-            <w:tcW w:type="dxa" w:w="820"/>
-            <w:tcBorders>
-              <w:top w:val="single" w:color="CCCCCC" w:sz="1"/>
-              <w:left w:val="single" w:color="CCCCCC" w:sz="1"/>
-              <w:bottom w:val="single" w:color="CCCCCC" w:sz="1"/>
-              <w:right w:val="single" w:color="CCCCCC" w:sz="1"/>
-            </w:tcBorders>
-            <w:shd w:fill="F2F9FF" w:val="clear"/>
-            <w:tcMar>
-              <w:top w:type="dxa" w:w="60"/>
-              <w:left w:type="dxa" w:w="100"/>
-              <w:bottom w:type="dxa" w:w="60"/>
-              <w:right w:type="dxa" w:w="100"/>
-            </w:tcMar>
-            <w:vAlign w:val="center"/>
-          </w:tcPr>
-          <w:p>
-            <w:r>
-              <w:rPr>
-                <w:rFonts w:ascii="Arial" w:cs="Arial" w:eastAsia="Arial" w:hAnsi="Arial"/>
-                <w:b w:val="false"/>
-                <w:bCs w:val="false"/>
-                <w:sz w:val="15"/>
-                <w:szCs w:val="15"/>
-              </w:rPr>
-              <w:t xml:space="preserve">1.830%</w:t>
-            </w:r>
-          </w:p>
-        </w:tc>
-        <w:tc>
-          <w:tcPr>
-            <w:tcW w:type="dxa" w:w="560"/>
-            <w:tcBorders>
-              <w:top w:val="single" w:color="CCCCCC" w:sz="1"/>
-              <w:left w:val="single" w:color="CCCCCC" w:sz="1"/>
-              <w:bottom w:val="single" w:color="CCCCCC" w:sz="1"/>
-              <w:right w:val="single" w:color="CCCCCC" w:sz="1"/>
-            </w:tcBorders>
-            <w:shd w:fill="F2F9FF" w:val="clear"/>
-            <w:tcMar>
-              <w:top w:type="dxa" w:w="60"/>
-              <w:left w:type="dxa" w:w="100"/>
-              <w:bottom w:type="dxa" w:w="60"/>
-              <w:right w:type="dxa" w:w="100"/>
-            </w:tcMar>
-            <w:vAlign w:val="center"/>
-          </w:tcPr>
-          <w:p>
-            <w:r>
-              <w:rPr>
-                <w:rFonts w:ascii="Arial" w:cs="Arial" w:eastAsia="Arial" w:hAnsi="Arial"/>
-                <w:b w:val="false"/>
-                <w:bCs w:val="false"/>
-                <w:sz w:val="15"/>
-                <w:szCs w:val="15"/>
-              </w:rPr>
-              <w:t xml:space="preserve">WIN</w:t>
-            </w:r>
-          </w:p>
-        </w:tc>
-        <w:tc>
-          <w:tcPr>
-            <w:tcW w:type="dxa" w:w="2120"/>
+            <w:tcW w:type="dxa" w:w="1920"/>
             <w:tcBorders>
               <w:top w:val="single" w:color="CCCCCC" w:sz="1"/>
               <w:left w:val="single" w:color="CCCCCC" w:sz="1"/>
@@ -3114,6 +3121,9 @@
         </w:tc>
       </w:tr>
       <w:tr>
+        <w:trPr>
+          <w:cantSplit/>
+        </w:trPr>
         <w:tc>
           <w:tcPr>
             <w:tcW w:type="dxa" w:w="1120"/>
@@ -3146,6 +3156,96 @@
         </w:tc>
         <w:tc>
           <w:tcPr>
+            <w:tcW w:type="dxa" w:w="760"/>
+            <w:tcBorders>
+              <w:top w:val="single" w:color="CCCCCC" w:sz="1"/>
+              <w:left w:val="single" w:color="CCCCCC" w:sz="1"/>
+              <w:bottom w:val="single" w:color="CCCCCC" w:sz="1"/>
+              <w:right w:val="single" w:color="CCCCCC" w:sz="1"/>
+            </w:tcBorders>
+            <w:tcMar>
+              <w:top w:type="dxa" w:w="60"/>
+              <w:left w:type="dxa" w:w="100"/>
+              <w:bottom w:type="dxa" w:w="60"/>
+              <w:right w:type="dxa" w:w="100"/>
+            </w:tcMar>
+            <w:vAlign w:val="center"/>
+          </w:tcPr>
+          <w:p>
+            <w:r>
+              <w:rPr>
+                <w:rFonts w:ascii="Arial" w:cs="Arial" w:eastAsia="Arial" w:hAnsi="Arial"/>
+                <w:b w:val="false"/>
+                <w:bCs w:val="false"/>
+                <w:sz w:val="15"/>
+                <w:szCs w:val="15"/>
+              </w:rPr>
+              <w:t xml:space="preserve">672</w:t>
+            </w:r>
+          </w:p>
+        </w:tc>
+        <w:tc>
+          <w:tcPr>
+            <w:tcW w:type="dxa" w:w="800"/>
+            <w:tcBorders>
+              <w:top w:val="single" w:color="CCCCCC" w:sz="1"/>
+              <w:left w:val="single" w:color="CCCCCC" w:sz="1"/>
+              <w:bottom w:val="single" w:color="CCCCCC" w:sz="1"/>
+              <w:right w:val="single" w:color="CCCCCC" w:sz="1"/>
+            </w:tcBorders>
+            <w:tcMar>
+              <w:top w:type="dxa" w:w="60"/>
+              <w:left w:type="dxa" w:w="100"/>
+              <w:bottom w:type="dxa" w:w="60"/>
+              <w:right w:type="dxa" w:w="100"/>
+            </w:tcMar>
+            <w:vAlign w:val="center"/>
+          </w:tcPr>
+          <w:p>
+            <w:r>
+              <w:rPr>
+                <w:rFonts w:ascii="Arial" w:cs="Arial" w:eastAsia="Arial" w:hAnsi="Arial"/>
+                <w:b w:val="false"/>
+                <w:bCs w:val="false"/>
+                <w:sz w:val="15"/>
+                <w:szCs w:val="15"/>
+              </w:rPr>
+              <w:t xml:space="preserve">99.984%</w:t>
+            </w:r>
+          </w:p>
+        </w:tc>
+        <w:tc>
+          <w:tcPr>
+            <w:tcW w:type="dxa" w:w="860"/>
+            <w:tcBorders>
+              <w:top w:val="single" w:color="CCCCCC" w:sz="1"/>
+              <w:left w:val="single" w:color="CCCCCC" w:sz="1"/>
+              <w:bottom w:val="single" w:color="CCCCCC" w:sz="1"/>
+              <w:right w:val="single" w:color="CCCCCC" w:sz="1"/>
+            </w:tcBorders>
+            <w:tcMar>
+              <w:top w:type="dxa" w:w="60"/>
+              <w:left w:type="dxa" w:w="100"/>
+              <w:bottom w:type="dxa" w:w="60"/>
+              <w:right w:type="dxa" w:w="100"/>
+            </w:tcMar>
+            <w:vAlign w:val="center"/>
+          </w:tcPr>
+          <w:p>
+            <w:r>
+              <w:rPr>
+                <w:rFonts w:ascii="Arial" w:cs="Arial" w:eastAsia="Arial" w:hAnsi="Arial"/>
+                <w:b w:val="false"/>
+                <w:bCs w:val="false"/>
+                <w:sz w:val="15"/>
+                <w:szCs w:val="15"/>
+              </w:rPr>
+              <w:t xml:space="preserve">99.500%</w:t>
+            </w:r>
+          </w:p>
+        </w:tc>
+        <w:tc>
+          <w:tcPr>
             <w:tcW w:type="dxa" w:w="560"/>
             <w:tcBorders>
               <w:top w:val="single" w:color="CCCCCC" w:sz="1"/>
@@ -3170,67 +3270,67 @@
                 <w:sz w:val="15"/>
                 <w:szCs w:val="15"/>
               </w:rPr>
-              <w:t xml:space="preserve">672</w:t>
-            </w:r>
-          </w:p>
-        </w:tc>
-        <w:tc>
-          <w:tcPr>
-            <w:tcW w:type="dxa" w:w="800"/>
-            <w:tcBorders>
-              <w:top w:val="single" w:color="CCCCCC" w:sz="1"/>
-              <w:left w:val="single" w:color="CCCCCC" w:sz="1"/>
-              <w:bottom w:val="single" w:color="CCCCCC" w:sz="1"/>
-              <w:right w:val="single" w:color="CCCCCC" w:sz="1"/>
-            </w:tcBorders>
-            <w:tcMar>
-              <w:top w:type="dxa" w:w="60"/>
-              <w:left w:type="dxa" w:w="100"/>
-              <w:bottom w:type="dxa" w:w="60"/>
-              <w:right w:type="dxa" w:w="100"/>
-            </w:tcMar>
-            <w:vAlign w:val="center"/>
-          </w:tcPr>
-          <w:p>
-            <w:r>
-              <w:rPr>
-                <w:rFonts w:ascii="Arial" w:cs="Arial" w:eastAsia="Arial" w:hAnsi="Arial"/>
-                <w:b w:val="false"/>
-                <w:bCs w:val="false"/>
-                <w:sz w:val="15"/>
-                <w:szCs w:val="15"/>
-              </w:rPr>
-              <w:t xml:space="preserve">99.984%</w:t>
-            </w:r>
-          </w:p>
-        </w:tc>
-        <w:tc>
-          <w:tcPr>
-            <w:tcW w:type="dxa" w:w="860"/>
-            <w:tcBorders>
-              <w:top w:val="single" w:color="CCCCCC" w:sz="1"/>
-              <w:left w:val="single" w:color="CCCCCC" w:sz="1"/>
-              <w:bottom w:val="single" w:color="CCCCCC" w:sz="1"/>
-              <w:right w:val="single" w:color="CCCCCC" w:sz="1"/>
-            </w:tcBorders>
-            <w:tcMar>
-              <w:top w:type="dxa" w:w="60"/>
-              <w:left w:type="dxa" w:w="100"/>
-              <w:bottom w:type="dxa" w:w="60"/>
-              <w:right w:type="dxa" w:w="100"/>
-            </w:tcMar>
-            <w:vAlign w:val="center"/>
-          </w:tcPr>
-          <w:p>
-            <w:r>
-              <w:rPr>
-                <w:rFonts w:ascii="Arial" w:cs="Arial" w:eastAsia="Arial" w:hAnsi="Arial"/>
-                <w:b w:val="false"/>
-                <w:bCs w:val="false"/>
-                <w:sz w:val="15"/>
-                <w:szCs w:val="15"/>
-              </w:rPr>
-              <w:t xml:space="preserve">99.500%</w:t>
+              <w:t xml:space="preserve">WIN</w:t>
+            </w:r>
+          </w:p>
+        </w:tc>
+        <w:tc>
+          <w:tcPr>
+            <w:tcW w:type="dxa" w:w="680"/>
+            <w:tcBorders>
+              <w:top w:val="single" w:color="CCCCCC" w:sz="1"/>
+              <w:left w:val="single" w:color="CCCCCC" w:sz="1"/>
+              <w:bottom w:val="single" w:color="CCCCCC" w:sz="1"/>
+              <w:right w:val="single" w:color="CCCCCC" w:sz="1"/>
+            </w:tcBorders>
+            <w:tcMar>
+              <w:top w:type="dxa" w:w="60"/>
+              <w:left w:type="dxa" w:w="100"/>
+              <w:bottom w:type="dxa" w:w="60"/>
+              <w:right w:type="dxa" w:w="100"/>
+            </w:tcMar>
+            <w:vAlign w:val="center"/>
+          </w:tcPr>
+          <w:p>
+            <w:r>
+              <w:rPr>
+                <w:rFonts w:ascii="Arial" w:cs="Arial" w:eastAsia="Arial" w:hAnsi="Arial"/>
+                <w:b w:val="false"/>
+                <w:bCs w:val="false"/>
+                <w:sz w:val="15"/>
+                <w:szCs w:val="15"/>
+              </w:rPr>
+              <w:t xml:space="preserve">0.378%</w:t>
+            </w:r>
+          </w:p>
+        </w:tc>
+        <w:tc>
+          <w:tcPr>
+            <w:tcW w:type="dxa" w:w="820"/>
+            <w:tcBorders>
+              <w:top w:val="single" w:color="CCCCCC" w:sz="1"/>
+              <w:left w:val="single" w:color="CCCCCC" w:sz="1"/>
+              <w:bottom w:val="single" w:color="CCCCCC" w:sz="1"/>
+              <w:right w:val="single" w:color="CCCCCC" w:sz="1"/>
+            </w:tcBorders>
+            <w:tcMar>
+              <w:top w:type="dxa" w:w="60"/>
+              <w:left w:type="dxa" w:w="100"/>
+              <w:bottom w:type="dxa" w:w="60"/>
+              <w:right w:type="dxa" w:w="100"/>
+            </w:tcMar>
+            <w:vAlign w:val="center"/>
+          </w:tcPr>
+          <w:p>
+            <w:r>
+              <w:rPr>
+                <w:rFonts w:ascii="Arial" w:cs="Arial" w:eastAsia="Arial" w:hAnsi="Arial"/>
+                <w:b w:val="false"/>
+                <w:bCs w:val="false"/>
+                <w:sz w:val="15"/>
+                <w:szCs w:val="15"/>
+              </w:rPr>
+              <w:t xml:space="preserve">2.960%</w:t>
             </w:r>
           </w:p>
         </w:tc>
@@ -3266,97 +3366,7 @@
         </w:tc>
         <w:tc>
           <w:tcPr>
-            <w:tcW w:type="dxa" w:w="680"/>
-            <w:tcBorders>
-              <w:top w:val="single" w:color="CCCCCC" w:sz="1"/>
-              <w:left w:val="single" w:color="CCCCCC" w:sz="1"/>
-              <w:bottom w:val="single" w:color="CCCCCC" w:sz="1"/>
-              <w:right w:val="single" w:color="CCCCCC" w:sz="1"/>
-            </w:tcBorders>
-            <w:tcMar>
-              <w:top w:type="dxa" w:w="60"/>
-              <w:left w:type="dxa" w:w="100"/>
-              <w:bottom w:type="dxa" w:w="60"/>
-              <w:right w:type="dxa" w:w="100"/>
-            </w:tcMar>
-            <w:vAlign w:val="center"/>
-          </w:tcPr>
-          <w:p>
-            <w:r>
-              <w:rPr>
-                <w:rFonts w:ascii="Arial" w:cs="Arial" w:eastAsia="Arial" w:hAnsi="Arial"/>
-                <w:b w:val="false"/>
-                <w:bCs w:val="false"/>
-                <w:sz w:val="15"/>
-                <w:szCs w:val="15"/>
-              </w:rPr>
-              <w:t xml:space="preserve">0.378%</w:t>
-            </w:r>
-          </w:p>
-        </w:tc>
-        <w:tc>
-          <w:tcPr>
-            <w:tcW w:type="dxa" w:w="820"/>
-            <w:tcBorders>
-              <w:top w:val="single" w:color="CCCCCC" w:sz="1"/>
-              <w:left w:val="single" w:color="CCCCCC" w:sz="1"/>
-              <w:bottom w:val="single" w:color="CCCCCC" w:sz="1"/>
-              <w:right w:val="single" w:color="CCCCCC" w:sz="1"/>
-            </w:tcBorders>
-            <w:tcMar>
-              <w:top w:type="dxa" w:w="60"/>
-              <w:left w:type="dxa" w:w="100"/>
-              <w:bottom w:type="dxa" w:w="60"/>
-              <w:right w:type="dxa" w:w="100"/>
-            </w:tcMar>
-            <w:vAlign w:val="center"/>
-          </w:tcPr>
-          <w:p>
-            <w:r>
-              <w:rPr>
-                <w:rFonts w:ascii="Arial" w:cs="Arial" w:eastAsia="Arial" w:hAnsi="Arial"/>
-                <w:b w:val="false"/>
-                <w:bCs w:val="false"/>
-                <w:sz w:val="15"/>
-                <w:szCs w:val="15"/>
-              </w:rPr>
-              <w:t xml:space="preserve">2.960%</w:t>
-            </w:r>
-          </w:p>
-        </w:tc>
-        <w:tc>
-          <w:tcPr>
-            <w:tcW w:type="dxa" w:w="560"/>
-            <w:tcBorders>
-              <w:top w:val="single" w:color="CCCCCC" w:sz="1"/>
-              <w:left w:val="single" w:color="CCCCCC" w:sz="1"/>
-              <w:bottom w:val="single" w:color="CCCCCC" w:sz="1"/>
-              <w:right w:val="single" w:color="CCCCCC" w:sz="1"/>
-            </w:tcBorders>
-            <w:tcMar>
-              <w:top w:type="dxa" w:w="60"/>
-              <w:left w:type="dxa" w:w="100"/>
-              <w:bottom w:type="dxa" w:w="60"/>
-              <w:right w:type="dxa" w:w="100"/>
-            </w:tcMar>
-            <w:vAlign w:val="center"/>
-          </w:tcPr>
-          <w:p>
-            <w:r>
-              <w:rPr>
-                <w:rFonts w:ascii="Arial" w:cs="Arial" w:eastAsia="Arial" w:hAnsi="Arial"/>
-                <w:b w:val="false"/>
-                <w:bCs w:val="false"/>
-                <w:sz w:val="15"/>
-                <w:szCs w:val="15"/>
-              </w:rPr>
-              <w:t xml:space="preserve">WIN</w:t>
-            </w:r>
-          </w:p>
-        </w:tc>
-        <w:tc>
-          <w:tcPr>
-            <w:tcW w:type="dxa" w:w="2120"/>
+            <w:tcW w:type="dxa" w:w="1920"/>
             <w:tcBorders>
               <w:top w:val="single" w:color="CCCCCC" w:sz="1"/>
               <w:left w:val="single" w:color="CCCCCC" w:sz="1"/>
@@ -3476,6 +3486,9 @@
         </w:tc>
       </w:tr>
       <w:tr>
+        <w:trPr>
+          <w:cantSplit/>
+        </w:trPr>
         <w:tc>
           <w:tcPr>
             <w:tcW w:type="dxa" w:w="1120"/>
@@ -3509,6 +3522,99 @@
         </w:tc>
         <w:tc>
           <w:tcPr>
+            <w:tcW w:type="dxa" w:w="760"/>
+            <w:tcBorders>
+              <w:top w:val="single" w:color="CCCCCC" w:sz="1"/>
+              <w:left w:val="single" w:color="CCCCCC" w:sz="1"/>
+              <w:bottom w:val="single" w:color="CCCCCC" w:sz="1"/>
+              <w:right w:val="single" w:color="CCCCCC" w:sz="1"/>
+            </w:tcBorders>
+            <w:shd w:fill="F2F9FF" w:val="clear"/>
+            <w:tcMar>
+              <w:top w:type="dxa" w:w="60"/>
+              <w:left w:type="dxa" w:w="100"/>
+              <w:bottom w:type="dxa" w:w="60"/>
+              <w:right w:type="dxa" w:w="100"/>
+            </w:tcMar>
+            <w:vAlign w:val="center"/>
+          </w:tcPr>
+          <w:p>
+            <w:r>
+              <w:rPr>
+                <w:rFonts w:ascii="Arial" w:cs="Arial" w:eastAsia="Arial" w:hAnsi="Arial"/>
+                <w:b w:val="false"/>
+                <w:bCs w:val="false"/>
+                <w:sz w:val="15"/>
+                <w:szCs w:val="15"/>
+              </w:rPr>
+              <w:t xml:space="preserve">200</w:t>
+            </w:r>
+          </w:p>
+        </w:tc>
+        <w:tc>
+          <w:tcPr>
+            <w:tcW w:type="dxa" w:w="800"/>
+            <w:tcBorders>
+              <w:top w:val="single" w:color="CCCCCC" w:sz="1"/>
+              <w:left w:val="single" w:color="CCCCCC" w:sz="1"/>
+              <w:bottom w:val="single" w:color="CCCCCC" w:sz="1"/>
+              <w:right w:val="single" w:color="CCCCCC" w:sz="1"/>
+            </w:tcBorders>
+            <w:shd w:fill="F2F9FF" w:val="clear"/>
+            <w:tcMar>
+              <w:top w:type="dxa" w:w="60"/>
+              <w:left w:type="dxa" w:w="100"/>
+              <w:bottom w:type="dxa" w:w="60"/>
+              <w:right w:type="dxa" w:w="100"/>
+            </w:tcMar>
+            <w:vAlign w:val="center"/>
+          </w:tcPr>
+          <w:p>
+            <w:r>
+              <w:rPr>
+                <w:rFonts w:ascii="Arial" w:cs="Arial" w:eastAsia="Arial" w:hAnsi="Arial"/>
+                <w:b w:val="false"/>
+                <w:bCs w:val="false"/>
+                <w:sz w:val="15"/>
+                <w:szCs w:val="15"/>
+              </w:rPr>
+              <w:t xml:space="preserve">100.000%</w:t>
+            </w:r>
+          </w:p>
+        </w:tc>
+        <w:tc>
+          <w:tcPr>
+            <w:tcW w:type="dxa" w:w="860"/>
+            <w:tcBorders>
+              <w:top w:val="single" w:color="CCCCCC" w:sz="1"/>
+              <w:left w:val="single" w:color="CCCCCC" w:sz="1"/>
+              <w:bottom w:val="single" w:color="CCCCCC" w:sz="1"/>
+              <w:right w:val="single" w:color="CCCCCC" w:sz="1"/>
+            </w:tcBorders>
+            <w:shd w:fill="F2F9FF" w:val="clear"/>
+            <w:tcMar>
+              <w:top w:type="dxa" w:w="60"/>
+              <w:left w:type="dxa" w:w="100"/>
+              <w:bottom w:type="dxa" w:w="60"/>
+              <w:right w:type="dxa" w:w="100"/>
+            </w:tcMar>
+            <w:vAlign w:val="center"/>
+          </w:tcPr>
+          <w:p>
+            <w:r>
+              <w:rPr>
+                <w:rFonts w:ascii="Arial" w:cs="Arial" w:eastAsia="Arial" w:hAnsi="Arial"/>
+                <w:b w:val="false"/>
+                <w:bCs w:val="false"/>
+                <w:sz w:val="15"/>
+                <w:szCs w:val="15"/>
+              </w:rPr>
+              <w:t xml:space="preserve">99.900%</w:t>
+            </w:r>
+          </w:p>
+        </w:tc>
+        <w:tc>
+          <w:tcPr>
             <w:tcW w:type="dxa" w:w="560"/>
             <w:tcBorders>
               <w:top w:val="single" w:color="CCCCCC" w:sz="1"/>
@@ -3534,69 +3640,69 @@
                 <w:sz w:val="15"/>
                 <w:szCs w:val="15"/>
               </w:rPr>
-              <w:t xml:space="preserve">200</w:t>
-            </w:r>
-          </w:p>
-        </w:tc>
-        <w:tc>
-          <w:tcPr>
-            <w:tcW w:type="dxa" w:w="800"/>
-            <w:tcBorders>
-              <w:top w:val="single" w:color="CCCCCC" w:sz="1"/>
-              <w:left w:val="single" w:color="CCCCCC" w:sz="1"/>
-              <w:bottom w:val="single" w:color="CCCCCC" w:sz="1"/>
-              <w:right w:val="single" w:color="CCCCCC" w:sz="1"/>
-            </w:tcBorders>
-            <w:shd w:fill="F2F9FF" w:val="clear"/>
-            <w:tcMar>
-              <w:top w:type="dxa" w:w="60"/>
-              <w:left w:type="dxa" w:w="100"/>
-              <w:bottom w:type="dxa" w:w="60"/>
-              <w:right w:type="dxa" w:w="100"/>
-            </w:tcMar>
-            <w:vAlign w:val="center"/>
-          </w:tcPr>
-          <w:p>
-            <w:r>
-              <w:rPr>
-                <w:rFonts w:ascii="Arial" w:cs="Arial" w:eastAsia="Arial" w:hAnsi="Arial"/>
-                <w:b w:val="false"/>
-                <w:bCs w:val="false"/>
-                <w:sz w:val="15"/>
-                <w:szCs w:val="15"/>
-              </w:rPr>
-              <w:t xml:space="preserve">100.000%</w:t>
-            </w:r>
-          </w:p>
-        </w:tc>
-        <w:tc>
-          <w:tcPr>
-            <w:tcW w:type="dxa" w:w="860"/>
-            <w:tcBorders>
-              <w:top w:val="single" w:color="CCCCCC" w:sz="1"/>
-              <w:left w:val="single" w:color="CCCCCC" w:sz="1"/>
-              <w:bottom w:val="single" w:color="CCCCCC" w:sz="1"/>
-              <w:right w:val="single" w:color="CCCCCC" w:sz="1"/>
-            </w:tcBorders>
-            <w:shd w:fill="F2F9FF" w:val="clear"/>
-            <w:tcMar>
-              <w:top w:type="dxa" w:w="60"/>
-              <w:left w:type="dxa" w:w="100"/>
-              <w:bottom w:type="dxa" w:w="60"/>
-              <w:right w:type="dxa" w:w="100"/>
-            </w:tcMar>
-            <w:vAlign w:val="center"/>
-          </w:tcPr>
-          <w:p>
-            <w:r>
-              <w:rPr>
-                <w:rFonts w:ascii="Arial" w:cs="Arial" w:eastAsia="Arial" w:hAnsi="Arial"/>
-                <w:b w:val="false"/>
-                <w:bCs w:val="false"/>
-                <w:sz w:val="15"/>
-                <w:szCs w:val="15"/>
-              </w:rPr>
-              <w:t xml:space="preserve">99.900%</w:t>
+              <w:t xml:space="preserve">WIN</w:t>
+            </w:r>
+          </w:p>
+        </w:tc>
+        <w:tc>
+          <w:tcPr>
+            <w:tcW w:type="dxa" w:w="680"/>
+            <w:tcBorders>
+              <w:top w:val="single" w:color="CCCCCC" w:sz="1"/>
+              <w:left w:val="single" w:color="CCCCCC" w:sz="1"/>
+              <w:bottom w:val="single" w:color="CCCCCC" w:sz="1"/>
+              <w:right w:val="single" w:color="CCCCCC" w:sz="1"/>
+            </w:tcBorders>
+            <w:shd w:fill="F2F9FF" w:val="clear"/>
+            <w:tcMar>
+              <w:top w:type="dxa" w:w="60"/>
+              <w:left w:type="dxa" w:w="100"/>
+              <w:bottom w:type="dxa" w:w="60"/>
+              <w:right w:type="dxa" w:w="100"/>
+            </w:tcMar>
+            <w:vAlign w:val="center"/>
+          </w:tcPr>
+          <w:p>
+            <w:r>
+              <w:rPr>
+                <w:rFonts w:ascii="Arial" w:cs="Arial" w:eastAsia="Arial" w:hAnsi="Arial"/>
+                <w:b w:val="false"/>
+                <w:bCs w:val="false"/>
+                <w:sz w:val="15"/>
+                <w:szCs w:val="15"/>
+              </w:rPr>
+              <w:t xml:space="preserve">0.471%</w:t>
+            </w:r>
+          </w:p>
+        </w:tc>
+        <w:tc>
+          <w:tcPr>
+            <w:tcW w:type="dxa" w:w="820"/>
+            <w:tcBorders>
+              <w:top w:val="single" w:color="CCCCCC" w:sz="1"/>
+              <w:left w:val="single" w:color="CCCCCC" w:sz="1"/>
+              <w:bottom w:val="single" w:color="CCCCCC" w:sz="1"/>
+              <w:right w:val="single" w:color="CCCCCC" w:sz="1"/>
+            </w:tcBorders>
+            <w:shd w:fill="F2F9FF" w:val="clear"/>
+            <w:tcMar>
+              <w:top w:type="dxa" w:w="60"/>
+              <w:left w:type="dxa" w:w="100"/>
+              <w:bottom w:type="dxa" w:w="60"/>
+              <w:right w:type="dxa" w:w="100"/>
+            </w:tcMar>
+            <w:vAlign w:val="center"/>
+          </w:tcPr>
+          <w:p>
+            <w:r>
+              <w:rPr>
+                <w:rFonts w:ascii="Arial" w:cs="Arial" w:eastAsia="Arial" w:hAnsi="Arial"/>
+                <w:b w:val="false"/>
+                <w:bCs w:val="false"/>
+                <w:sz w:val="15"/>
+                <w:szCs w:val="15"/>
+              </w:rPr>
+              <w:t xml:space="preserve">5.100%</w:t>
             </w:r>
           </w:p>
         </w:tc>
@@ -3633,100 +3739,7 @@
         </w:tc>
         <w:tc>
           <w:tcPr>
-            <w:tcW w:type="dxa" w:w="680"/>
-            <w:tcBorders>
-              <w:top w:val="single" w:color="CCCCCC" w:sz="1"/>
-              <w:left w:val="single" w:color="CCCCCC" w:sz="1"/>
-              <w:bottom w:val="single" w:color="CCCCCC" w:sz="1"/>
-              <w:right w:val="single" w:color="CCCCCC" w:sz="1"/>
-            </w:tcBorders>
-            <w:shd w:fill="F2F9FF" w:val="clear"/>
-            <w:tcMar>
-              <w:top w:type="dxa" w:w="60"/>
-              <w:left w:type="dxa" w:w="100"/>
-              <w:bottom w:type="dxa" w:w="60"/>
-              <w:right w:type="dxa" w:w="100"/>
-            </w:tcMar>
-            <w:vAlign w:val="center"/>
-          </w:tcPr>
-          <w:p>
-            <w:r>
-              <w:rPr>
-                <w:rFonts w:ascii="Arial" w:cs="Arial" w:eastAsia="Arial" w:hAnsi="Arial"/>
-                <w:b w:val="false"/>
-                <w:bCs w:val="false"/>
-                <w:sz w:val="15"/>
-                <w:szCs w:val="15"/>
-              </w:rPr>
-              <w:t xml:space="preserve">0.471%</w:t>
-            </w:r>
-          </w:p>
-        </w:tc>
-        <w:tc>
-          <w:tcPr>
-            <w:tcW w:type="dxa" w:w="820"/>
-            <w:tcBorders>
-              <w:top w:val="single" w:color="CCCCCC" w:sz="1"/>
-              <w:left w:val="single" w:color="CCCCCC" w:sz="1"/>
-              <w:bottom w:val="single" w:color="CCCCCC" w:sz="1"/>
-              <w:right w:val="single" w:color="CCCCCC" w:sz="1"/>
-            </w:tcBorders>
-            <w:shd w:fill="F2F9FF" w:val="clear"/>
-            <w:tcMar>
-              <w:top w:type="dxa" w:w="60"/>
-              <w:left w:type="dxa" w:w="100"/>
-              <w:bottom w:type="dxa" w:w="60"/>
-              <w:right w:type="dxa" w:w="100"/>
-            </w:tcMar>
-            <w:vAlign w:val="center"/>
-          </w:tcPr>
-          <w:p>
-            <w:r>
-              <w:rPr>
-                <w:rFonts w:ascii="Arial" w:cs="Arial" w:eastAsia="Arial" w:hAnsi="Arial"/>
-                <w:b w:val="false"/>
-                <w:bCs w:val="false"/>
-                <w:sz w:val="15"/>
-                <w:szCs w:val="15"/>
-              </w:rPr>
-              <w:t xml:space="preserve">5.100%</w:t>
-            </w:r>
-          </w:p>
-        </w:tc>
-        <w:tc>
-          <w:tcPr>
-            <w:tcW w:type="dxa" w:w="560"/>
-            <w:tcBorders>
-              <w:top w:val="single" w:color="CCCCCC" w:sz="1"/>
-              <w:left w:val="single" w:color="CCCCCC" w:sz="1"/>
-              <w:bottom w:val="single" w:color="CCCCCC" w:sz="1"/>
-              <w:right w:val="single" w:color="CCCCCC" w:sz="1"/>
-            </w:tcBorders>
-            <w:shd w:fill="F2F9FF" w:val="clear"/>
-            <w:tcMar>
-              <w:top w:type="dxa" w:w="60"/>
-              <w:left w:type="dxa" w:w="100"/>
-              <w:bottom w:type="dxa" w:w="60"/>
-              <w:right w:type="dxa" w:w="100"/>
-            </w:tcMar>
-            <w:vAlign w:val="center"/>
-          </w:tcPr>
-          <w:p>
-            <w:r>
-              <w:rPr>
-                <w:rFonts w:ascii="Arial" w:cs="Arial" w:eastAsia="Arial" w:hAnsi="Arial"/>
-                <w:b w:val="false"/>
-                <w:bCs w:val="false"/>
-                <w:sz w:val="15"/>
-                <w:szCs w:val="15"/>
-              </w:rPr>
-              <w:t xml:space="preserve">WIN</w:t>
-            </w:r>
-          </w:p>
-        </w:tc>
-        <w:tc>
-          <w:tcPr>
-            <w:tcW w:type="dxa" w:w="2120"/>
+            <w:tcW w:type="dxa" w:w="1920"/>
             <w:tcBorders>
               <w:top w:val="single" w:color="CCCCCC" w:sz="1"/>
               <w:left w:val="single" w:color="CCCCCC" w:sz="1"/>
@@ -3850,6 +3863,9 @@
         </w:tc>
       </w:tr>
       <w:tr>
+        <w:trPr>
+          <w:cantSplit/>
+        </w:trPr>
         <w:tc>
           <w:tcPr>
             <w:tcW w:type="dxa" w:w="1120"/>
@@ -3882,6 +3898,96 @@
         </w:tc>
         <w:tc>
           <w:tcPr>
+            <w:tcW w:type="dxa" w:w="760"/>
+            <w:tcBorders>
+              <w:top w:val="single" w:color="CCCCCC" w:sz="1"/>
+              <w:left w:val="single" w:color="CCCCCC" w:sz="1"/>
+              <w:bottom w:val="single" w:color="CCCCCC" w:sz="1"/>
+              <w:right w:val="single" w:color="CCCCCC" w:sz="1"/>
+            </w:tcBorders>
+            <w:tcMar>
+              <w:top w:type="dxa" w:w="60"/>
+              <w:left w:type="dxa" w:w="100"/>
+              <w:bottom w:type="dxa" w:w="60"/>
+              <w:right w:type="dxa" w:w="100"/>
+            </w:tcMar>
+            <w:vAlign w:val="center"/>
+          </w:tcPr>
+          <w:p>
+            <w:r>
+              <w:rPr>
+                <w:rFonts w:ascii="Arial" w:cs="Arial" w:eastAsia="Arial" w:hAnsi="Arial"/>
+                <w:b w:val="false"/>
+                <w:bCs w:val="false"/>
+                <w:sz w:val="15"/>
+                <w:szCs w:val="15"/>
+              </w:rPr>
+              <w:t xml:space="preserve">200</w:t>
+            </w:r>
+          </w:p>
+        </w:tc>
+        <w:tc>
+          <w:tcPr>
+            <w:tcW w:type="dxa" w:w="800"/>
+            <w:tcBorders>
+              <w:top w:val="single" w:color="CCCCCC" w:sz="1"/>
+              <w:left w:val="single" w:color="CCCCCC" w:sz="1"/>
+              <w:bottom w:val="single" w:color="CCCCCC" w:sz="1"/>
+              <w:right w:val="single" w:color="CCCCCC" w:sz="1"/>
+            </w:tcBorders>
+            <w:tcMar>
+              <w:top w:type="dxa" w:w="60"/>
+              <w:left w:type="dxa" w:w="100"/>
+              <w:bottom w:type="dxa" w:w="60"/>
+              <w:right w:type="dxa" w:w="100"/>
+            </w:tcMar>
+            <w:vAlign w:val="center"/>
+          </w:tcPr>
+          <w:p>
+            <w:r>
+              <w:rPr>
+                <w:rFonts w:ascii="Arial" w:cs="Arial" w:eastAsia="Arial" w:hAnsi="Arial"/>
+                <w:b w:val="false"/>
+                <w:bCs w:val="false"/>
+                <w:sz w:val="15"/>
+                <w:szCs w:val="15"/>
+              </w:rPr>
+              <w:t xml:space="preserve">100.000%</w:t>
+            </w:r>
+          </w:p>
+        </w:tc>
+        <w:tc>
+          <w:tcPr>
+            <w:tcW w:type="dxa" w:w="860"/>
+            <w:tcBorders>
+              <w:top w:val="single" w:color="CCCCCC" w:sz="1"/>
+              <w:left w:val="single" w:color="CCCCCC" w:sz="1"/>
+              <w:bottom w:val="single" w:color="CCCCCC" w:sz="1"/>
+              <w:right w:val="single" w:color="CCCCCC" w:sz="1"/>
+            </w:tcBorders>
+            <w:tcMar>
+              <w:top w:type="dxa" w:w="60"/>
+              <w:left w:type="dxa" w:w="100"/>
+              <w:bottom w:type="dxa" w:w="60"/>
+              <w:right w:type="dxa" w:w="100"/>
+            </w:tcMar>
+            <w:vAlign w:val="center"/>
+          </w:tcPr>
+          <w:p>
+            <w:r>
+              <w:rPr>
+                <w:rFonts w:ascii="Arial" w:cs="Arial" w:eastAsia="Arial" w:hAnsi="Arial"/>
+                <w:b w:val="false"/>
+                <w:bCs w:val="false"/>
+                <w:sz w:val="15"/>
+                <w:szCs w:val="15"/>
+              </w:rPr>
+              <w:t xml:space="preserve">N.A.</w:t>
+            </w:r>
+          </w:p>
+        </w:tc>
+        <w:tc>
+          <w:tcPr>
             <w:tcW w:type="dxa" w:w="560"/>
             <w:tcBorders>
               <w:top w:val="single" w:color="CCCCCC" w:sz="1"/>
@@ -3906,43 +4012,43 @@
                 <w:sz w:val="15"/>
                 <w:szCs w:val="15"/>
               </w:rPr>
-              <w:t xml:space="preserve">200</w:t>
-            </w:r>
-          </w:p>
-        </w:tc>
-        <w:tc>
-          <w:tcPr>
-            <w:tcW w:type="dxa" w:w="800"/>
-            <w:tcBorders>
-              <w:top w:val="single" w:color="CCCCCC" w:sz="1"/>
-              <w:left w:val="single" w:color="CCCCCC" w:sz="1"/>
-              <w:bottom w:val="single" w:color="CCCCCC" w:sz="1"/>
-              <w:right w:val="single" w:color="CCCCCC" w:sz="1"/>
-            </w:tcBorders>
-            <w:tcMar>
-              <w:top w:type="dxa" w:w="60"/>
-              <w:left w:type="dxa" w:w="100"/>
-              <w:bottom w:type="dxa" w:w="60"/>
-              <w:right w:type="dxa" w:w="100"/>
-            </w:tcMar>
-            <w:vAlign w:val="center"/>
-          </w:tcPr>
-          <w:p>
-            <w:r>
-              <w:rPr>
-                <w:rFonts w:ascii="Arial" w:cs="Arial" w:eastAsia="Arial" w:hAnsi="Arial"/>
-                <w:b w:val="false"/>
-                <w:bCs w:val="false"/>
-                <w:sz w:val="15"/>
-                <w:szCs w:val="15"/>
-              </w:rPr>
-              <w:t xml:space="preserve">100.000%</w:t>
-            </w:r>
-          </w:p>
-        </w:tc>
-        <w:tc>
-          <w:tcPr>
-            <w:tcW w:type="dxa" w:w="860"/>
+              <w:t xml:space="preserve">n/c</w:t>
+            </w:r>
+          </w:p>
+        </w:tc>
+        <w:tc>
+          <w:tcPr>
+            <w:tcW w:type="dxa" w:w="680"/>
+            <w:tcBorders>
+              <w:top w:val="single" w:color="CCCCCC" w:sz="1"/>
+              <w:left w:val="single" w:color="CCCCCC" w:sz="1"/>
+              <w:bottom w:val="single" w:color="CCCCCC" w:sz="1"/>
+              <w:right w:val="single" w:color="CCCCCC" w:sz="1"/>
+            </w:tcBorders>
+            <w:tcMar>
+              <w:top w:type="dxa" w:w="60"/>
+              <w:left w:type="dxa" w:w="100"/>
+              <w:bottom w:type="dxa" w:w="60"/>
+              <w:right w:type="dxa" w:w="100"/>
+            </w:tcMar>
+            <w:vAlign w:val="center"/>
+          </w:tcPr>
+          <w:p>
+            <w:r>
+              <w:rPr>
+                <w:rFonts w:ascii="Arial" w:cs="Arial" w:eastAsia="Arial" w:hAnsi="Arial"/>
+                <w:b w:val="false"/>
+                <w:bCs w:val="false"/>
+                <w:sz w:val="15"/>
+                <w:szCs w:val="15"/>
+              </w:rPr>
+              <w:t xml:space="preserve">0.714%</w:t>
+            </w:r>
+          </w:p>
+        </w:tc>
+        <w:tc>
+          <w:tcPr>
+            <w:tcW w:type="dxa" w:w="820"/>
             <w:tcBorders>
               <w:top w:val="single" w:color="CCCCCC" w:sz="1"/>
               <w:left w:val="single" w:color="CCCCCC" w:sz="1"/>
@@ -4002,97 +4108,7 @@
         </w:tc>
         <w:tc>
           <w:tcPr>
-            <w:tcW w:type="dxa" w:w="680"/>
-            <w:tcBorders>
-              <w:top w:val="single" w:color="CCCCCC" w:sz="1"/>
-              <w:left w:val="single" w:color="CCCCCC" w:sz="1"/>
-              <w:bottom w:val="single" w:color="CCCCCC" w:sz="1"/>
-              <w:right w:val="single" w:color="CCCCCC" w:sz="1"/>
-            </w:tcBorders>
-            <w:tcMar>
-              <w:top w:type="dxa" w:w="60"/>
-              <w:left w:type="dxa" w:w="100"/>
-              <w:bottom w:type="dxa" w:w="60"/>
-              <w:right w:type="dxa" w:w="100"/>
-            </w:tcMar>
-            <w:vAlign w:val="center"/>
-          </w:tcPr>
-          <w:p>
-            <w:r>
-              <w:rPr>
-                <w:rFonts w:ascii="Arial" w:cs="Arial" w:eastAsia="Arial" w:hAnsi="Arial"/>
-                <w:b w:val="false"/>
-                <w:bCs w:val="false"/>
-                <w:sz w:val="15"/>
-                <w:szCs w:val="15"/>
-              </w:rPr>
-              <w:t xml:space="preserve">0.714%</w:t>
-            </w:r>
-          </w:p>
-        </w:tc>
-        <w:tc>
-          <w:tcPr>
-            <w:tcW w:type="dxa" w:w="820"/>
-            <w:tcBorders>
-              <w:top w:val="single" w:color="CCCCCC" w:sz="1"/>
-              <w:left w:val="single" w:color="CCCCCC" w:sz="1"/>
-              <w:bottom w:val="single" w:color="CCCCCC" w:sz="1"/>
-              <w:right w:val="single" w:color="CCCCCC" w:sz="1"/>
-            </w:tcBorders>
-            <w:tcMar>
-              <w:top w:type="dxa" w:w="60"/>
-              <w:left w:type="dxa" w:w="100"/>
-              <w:bottom w:type="dxa" w:w="60"/>
-              <w:right w:type="dxa" w:w="100"/>
-            </w:tcMar>
-            <w:vAlign w:val="center"/>
-          </w:tcPr>
-          <w:p>
-            <w:r>
-              <w:rPr>
-                <w:rFonts w:ascii="Arial" w:cs="Arial" w:eastAsia="Arial" w:hAnsi="Arial"/>
-                <w:b w:val="false"/>
-                <w:bCs w:val="false"/>
-                <w:sz w:val="15"/>
-                <w:szCs w:val="15"/>
-              </w:rPr>
-              <w:t xml:space="preserve">N.A.</w:t>
-            </w:r>
-          </w:p>
-        </w:tc>
-        <w:tc>
-          <w:tcPr>
-            <w:tcW w:type="dxa" w:w="560"/>
-            <w:tcBorders>
-              <w:top w:val="single" w:color="CCCCCC" w:sz="1"/>
-              <w:left w:val="single" w:color="CCCCCC" w:sz="1"/>
-              <w:bottom w:val="single" w:color="CCCCCC" w:sz="1"/>
-              <w:right w:val="single" w:color="CCCCCC" w:sz="1"/>
-            </w:tcBorders>
-            <w:tcMar>
-              <w:top w:type="dxa" w:w="60"/>
-              <w:left w:type="dxa" w:w="100"/>
-              <w:bottom w:type="dxa" w:w="60"/>
-              <w:right w:type="dxa" w:w="100"/>
-            </w:tcMar>
-            <w:vAlign w:val="center"/>
-          </w:tcPr>
-          <w:p>
-            <w:r>
-              <w:rPr>
-                <w:rFonts w:ascii="Arial" w:cs="Arial" w:eastAsia="Arial" w:hAnsi="Arial"/>
-                <w:b w:val="false"/>
-                <w:bCs w:val="false"/>
-                <w:sz w:val="15"/>
-                <w:szCs w:val="15"/>
-              </w:rPr>
-              <w:t xml:space="preserve">n/c</w:t>
-            </w:r>
-          </w:p>
-        </w:tc>
-        <w:tc>
-          <w:tcPr>
-            <w:tcW w:type="dxa" w:w="2120"/>
+            <w:tcW w:type="dxa" w:w="1920"/>
             <w:tcBorders>
               <w:top w:val="single" w:color="CCCCCC" w:sz="1"/>
               <w:left w:val="single" w:color="CCCCCC" w:sz="1"/>
@@ -4212,6 +4228,9 @@
         </w:tc>
       </w:tr>
       <w:tr>
+        <w:trPr>
+          <w:cantSplit/>
+        </w:trPr>
         <w:tc>
           <w:tcPr>
             <w:tcW w:type="dxa" w:w="1120"/>
@@ -4245,6 +4264,99 @@
         </w:tc>
         <w:tc>
           <w:tcPr>
+            <w:tcW w:type="dxa" w:w="760"/>
+            <w:tcBorders>
+              <w:top w:val="single" w:color="CCCCCC" w:sz="1"/>
+              <w:left w:val="single" w:color="CCCCCC" w:sz="1"/>
+              <w:bottom w:val="single" w:color="CCCCCC" w:sz="1"/>
+              <w:right w:val="single" w:color="CCCCCC" w:sz="1"/>
+            </w:tcBorders>
+            <w:shd w:fill="F2F9FF" w:val="clear"/>
+            <w:tcMar>
+              <w:top w:type="dxa" w:w="60"/>
+              <w:left w:type="dxa" w:w="100"/>
+              <w:bottom w:type="dxa" w:w="60"/>
+              <w:right w:type="dxa" w:w="100"/>
+            </w:tcMar>
+            <w:vAlign w:val="center"/>
+          </w:tcPr>
+          <w:p>
+            <w:r>
+              <w:rPr>
+                <w:rFonts w:ascii="Arial" w:cs="Arial" w:eastAsia="Arial" w:hAnsi="Arial"/>
+                <w:b w:val="false"/>
+                <w:bCs w:val="false"/>
+                <w:sz w:val="15"/>
+                <w:szCs w:val="15"/>
+              </w:rPr>
+              <w:t xml:space="preserve">3,288</w:t>
+            </w:r>
+          </w:p>
+        </w:tc>
+        <w:tc>
+          <w:tcPr>
+            <w:tcW w:type="dxa" w:w="800"/>
+            <w:tcBorders>
+              <w:top w:val="single" w:color="CCCCCC" w:sz="1"/>
+              <w:left w:val="single" w:color="CCCCCC" w:sz="1"/>
+              <w:bottom w:val="single" w:color="CCCCCC" w:sz="1"/>
+              <w:right w:val="single" w:color="CCCCCC" w:sz="1"/>
+            </w:tcBorders>
+            <w:shd w:fill="F2F9FF" w:val="clear"/>
+            <w:tcMar>
+              <w:top w:type="dxa" w:w="60"/>
+              <w:left w:type="dxa" w:w="100"/>
+              <w:bottom w:type="dxa" w:w="60"/>
+              <w:right w:type="dxa" w:w="100"/>
+            </w:tcMar>
+            <w:vAlign w:val="center"/>
+          </w:tcPr>
+          <w:p>
+            <w:r>
+              <w:rPr>
+                <w:rFonts w:ascii="Arial" w:cs="Arial" w:eastAsia="Arial" w:hAnsi="Arial"/>
+                <w:b w:val="false"/>
+                <w:bCs w:val="false"/>
+                <w:sz w:val="15"/>
+                <w:szCs w:val="15"/>
+              </w:rPr>
+              <w:t xml:space="preserve">99.758%</w:t>
+            </w:r>
+          </w:p>
+        </w:tc>
+        <w:tc>
+          <w:tcPr>
+            <w:tcW w:type="dxa" w:w="860"/>
+            <w:tcBorders>
+              <w:top w:val="single" w:color="CCCCCC" w:sz="1"/>
+              <w:left w:val="single" w:color="CCCCCC" w:sz="1"/>
+              <w:bottom w:val="single" w:color="CCCCCC" w:sz="1"/>
+              <w:right w:val="single" w:color="CCCCCC" w:sz="1"/>
+            </w:tcBorders>
+            <w:shd w:fill="F2F9FF" w:val="clear"/>
+            <w:tcMar>
+              <w:top w:type="dxa" w:w="60"/>
+              <w:left w:type="dxa" w:w="100"/>
+              <w:bottom w:type="dxa" w:w="60"/>
+              <w:right w:type="dxa" w:w="100"/>
+            </w:tcMar>
+            <w:vAlign w:val="center"/>
+          </w:tcPr>
+          <w:p>
+            <w:r>
+              <w:rPr>
+                <w:rFonts w:ascii="Arial" w:cs="Arial" w:eastAsia="Arial" w:hAnsi="Arial"/>
+                <w:b w:val="false"/>
+                <w:bCs w:val="false"/>
+                <w:sz w:val="15"/>
+                <w:szCs w:val="15"/>
+              </w:rPr>
+              <w:t xml:space="preserve">—</w:t>
+            </w:r>
+          </w:p>
+        </w:tc>
+        <w:tc>
+          <w:tcPr>
             <w:tcW w:type="dxa" w:w="560"/>
             <w:tcBorders>
               <w:top w:val="single" w:color="CCCCCC" w:sz="1"/>
@@ -4270,74 +4382,74 @@
                 <w:sz w:val="15"/>
                 <w:szCs w:val="15"/>
               </w:rPr>
-              <w:t xml:space="preserve">3,288</w:t>
-            </w:r>
-          </w:p>
-        </w:tc>
-        <w:tc>
-          <w:tcPr>
-            <w:tcW w:type="dxa" w:w="800"/>
-            <w:tcBorders>
-              <w:top w:val="single" w:color="CCCCCC" w:sz="1"/>
-              <w:left w:val="single" w:color="CCCCCC" w:sz="1"/>
-              <w:bottom w:val="single" w:color="CCCCCC" w:sz="1"/>
-              <w:right w:val="single" w:color="CCCCCC" w:sz="1"/>
-            </w:tcBorders>
-            <w:shd w:fill="F2F9FF" w:val="clear"/>
-            <w:tcMar>
-              <w:top w:type="dxa" w:w="60"/>
-              <w:left w:type="dxa" w:w="100"/>
-              <w:bottom w:type="dxa" w:w="60"/>
-              <w:right w:type="dxa" w:w="100"/>
-            </w:tcMar>
-            <w:vAlign w:val="center"/>
-          </w:tcPr>
-          <w:p>
-            <w:r>
-              <w:rPr>
-                <w:rFonts w:ascii="Arial" w:cs="Arial" w:eastAsia="Arial" w:hAnsi="Arial"/>
-                <w:b w:val="false"/>
-                <w:bCs w:val="false"/>
-                <w:sz w:val="15"/>
-                <w:szCs w:val="15"/>
-              </w:rPr>
-              <w:t xml:space="preserve">99.758%</w:t>
-            </w:r>
-          </w:p>
-        </w:tc>
-        <w:tc>
-          <w:tcPr>
-            <w:tcW w:type="dxa" w:w="860"/>
-            <w:tcBorders>
-              <w:top w:val="single" w:color="CCCCCC" w:sz="1"/>
-              <w:left w:val="single" w:color="CCCCCC" w:sz="1"/>
-              <w:bottom w:val="single" w:color="CCCCCC" w:sz="1"/>
-              <w:right w:val="single" w:color="CCCCCC" w:sz="1"/>
-            </w:tcBorders>
-            <w:shd w:fill="F2F9FF" w:val="clear"/>
-            <w:tcMar>
-              <w:top w:type="dxa" w:w="60"/>
-              <w:left w:type="dxa" w:w="100"/>
-              <w:bottom w:type="dxa" w:w="60"/>
-              <w:right w:type="dxa" w:w="100"/>
-            </w:tcMar>
-            <w:vAlign w:val="center"/>
-          </w:tcPr>
-          <w:p>
-            <w:r>
-              <w:rPr>
-                <w:rFonts w:ascii="Arial" w:cs="Arial" w:eastAsia="Arial" w:hAnsi="Arial"/>
-                <w:b w:val="false"/>
-                <w:bCs w:val="false"/>
-                <w:sz w:val="15"/>
-                <w:szCs w:val="15"/>
-              </w:rPr>
               <w:t xml:space="preserve">—</w:t>
             </w:r>
           </w:p>
         </w:tc>
         <w:tc>
           <w:tcPr>
+            <w:tcW w:type="dxa" w:w="680"/>
+            <w:tcBorders>
+              <w:top w:val="single" w:color="CCCCCC" w:sz="1"/>
+              <w:left w:val="single" w:color="CCCCCC" w:sz="1"/>
+              <w:bottom w:val="single" w:color="CCCCCC" w:sz="1"/>
+              <w:right w:val="single" w:color="CCCCCC" w:sz="1"/>
+            </w:tcBorders>
+            <w:shd w:fill="F2F9FF" w:val="clear"/>
+            <w:tcMar>
+              <w:top w:type="dxa" w:w="60"/>
+              <w:left w:type="dxa" w:w="100"/>
+              <w:bottom w:type="dxa" w:w="60"/>
+              <w:right w:type="dxa" w:w="100"/>
+            </w:tcMar>
+            <w:vAlign w:val="center"/>
+          </w:tcPr>
+          <w:p>
+            <w:r>
+              <w:rPr>
+                <w:rFonts w:ascii="Arial" w:cs="Arial" w:eastAsia="Arial" w:hAnsi="Arial"/>
+                <w:b w:val="false"/>
+                <w:bCs w:val="false"/>
+                <w:sz w:val="15"/>
+                <w:szCs w:val="15"/>
+              </w:rPr>
+              <w:t xml:space="preserve">0.544%</w:t>
+            </w:r>
+          </w:p>
+        </w:tc>
+        <w:tc>
+          <w:tcPr>
+            <w:tcW w:type="dxa" w:w="820"/>
+            <w:tcBorders>
+              <w:top w:val="single" w:color="CCCCCC" w:sz="1"/>
+              <w:left w:val="single" w:color="CCCCCC" w:sz="1"/>
+              <w:bottom w:val="single" w:color="CCCCCC" w:sz="1"/>
+              <w:right w:val="single" w:color="CCCCCC" w:sz="1"/>
+            </w:tcBorders>
+            <w:shd w:fill="F2F9FF" w:val="clear"/>
+            <w:tcMar>
+              <w:top w:type="dxa" w:w="60"/>
+              <w:left w:type="dxa" w:w="100"/>
+              <w:bottom w:type="dxa" w:w="60"/>
+              <w:right w:type="dxa" w:w="100"/>
+            </w:tcMar>
+            <w:vAlign w:val="center"/>
+          </w:tcPr>
+          <w:p>
+            <w:r>
+              <w:rPr>
+                <w:rFonts w:ascii="Arial" w:cs="Arial" w:eastAsia="Arial" w:hAnsi="Arial"/>
+                <w:b w:val="false"/>
+                <w:bCs w:val="false"/>
+                <w:sz w:val="15"/>
+                <w:szCs w:val="15"/>
+              </w:rPr>
+              <w:t xml:space="preserve">—</w:t>
+            </w:r>
+          </w:p>
+        </w:tc>
+        <w:tc>
+          <w:tcPr>
             <w:tcW w:type="dxa" w:w="560"/>
             <w:tcBorders>
               <w:top w:val="single" w:color="CCCCCC" w:sz="1"/>
@@ -4369,100 +4481,7 @@
         </w:tc>
         <w:tc>
           <w:tcPr>
-            <w:tcW w:type="dxa" w:w="680"/>
-            <w:tcBorders>
-              <w:top w:val="single" w:color="CCCCCC" w:sz="1"/>
-              <w:left w:val="single" w:color="CCCCCC" w:sz="1"/>
-              <w:bottom w:val="single" w:color="CCCCCC" w:sz="1"/>
-              <w:right w:val="single" w:color="CCCCCC" w:sz="1"/>
-            </w:tcBorders>
-            <w:shd w:fill="F2F9FF" w:val="clear"/>
-            <w:tcMar>
-              <w:top w:type="dxa" w:w="60"/>
-              <w:left w:type="dxa" w:w="100"/>
-              <w:bottom w:type="dxa" w:w="60"/>
-              <w:right w:type="dxa" w:w="100"/>
-            </w:tcMar>
-            <w:vAlign w:val="center"/>
-          </w:tcPr>
-          <w:p>
-            <w:r>
-              <w:rPr>
-                <w:rFonts w:ascii="Arial" w:cs="Arial" w:eastAsia="Arial" w:hAnsi="Arial"/>
-                <w:b w:val="false"/>
-                <w:bCs w:val="false"/>
-                <w:sz w:val="15"/>
-                <w:szCs w:val="15"/>
-              </w:rPr>
-              <w:t xml:space="preserve">0.544%</w:t>
-            </w:r>
-          </w:p>
-        </w:tc>
-        <w:tc>
-          <w:tcPr>
-            <w:tcW w:type="dxa" w:w="820"/>
-            <w:tcBorders>
-              <w:top w:val="single" w:color="CCCCCC" w:sz="1"/>
-              <w:left w:val="single" w:color="CCCCCC" w:sz="1"/>
-              <w:bottom w:val="single" w:color="CCCCCC" w:sz="1"/>
-              <w:right w:val="single" w:color="CCCCCC" w:sz="1"/>
-            </w:tcBorders>
-            <w:shd w:fill="F2F9FF" w:val="clear"/>
-            <w:tcMar>
-              <w:top w:type="dxa" w:w="60"/>
-              <w:left w:type="dxa" w:w="100"/>
-              <w:bottom w:type="dxa" w:w="60"/>
-              <w:right w:type="dxa" w:w="100"/>
-            </w:tcMar>
-            <w:vAlign w:val="center"/>
-          </w:tcPr>
-          <w:p>
-            <w:r>
-              <w:rPr>
-                <w:rFonts w:ascii="Arial" w:cs="Arial" w:eastAsia="Arial" w:hAnsi="Arial"/>
-                <w:b w:val="false"/>
-                <w:bCs w:val="false"/>
-                <w:sz w:val="15"/>
-                <w:szCs w:val="15"/>
-              </w:rPr>
-              <w:t xml:space="preserve">—</w:t>
-            </w:r>
-          </w:p>
-        </w:tc>
-        <w:tc>
-          <w:tcPr>
-            <w:tcW w:type="dxa" w:w="560"/>
-            <w:tcBorders>
-              <w:top w:val="single" w:color="CCCCCC" w:sz="1"/>
-              <w:left w:val="single" w:color="CCCCCC" w:sz="1"/>
-              <w:bottom w:val="single" w:color="CCCCCC" w:sz="1"/>
-              <w:right w:val="single" w:color="CCCCCC" w:sz="1"/>
-            </w:tcBorders>
-            <w:shd w:fill="F2F9FF" w:val="clear"/>
-            <w:tcMar>
-              <w:top w:type="dxa" w:w="60"/>
-              <w:left w:type="dxa" w:w="100"/>
-              <w:bottom w:type="dxa" w:w="60"/>
-              <w:right w:type="dxa" w:w="100"/>
-            </w:tcMar>
-            <w:vAlign w:val="center"/>
-          </w:tcPr>
-          <w:p>
-            <w:r>
-              <w:rPr>
-                <w:rFonts w:ascii="Arial" w:cs="Arial" w:eastAsia="Arial" w:hAnsi="Arial"/>
-                <w:b w:val="false"/>
-                <w:bCs w:val="false"/>
-                <w:sz w:val="15"/>
-                <w:szCs w:val="15"/>
-              </w:rPr>
-              <w:t xml:space="preserve">—</w:t>
-            </w:r>
-          </w:p>
-        </w:tc>
-        <w:tc>
-          <w:tcPr>
-            <w:tcW w:type="dxa" w:w="2120"/>
+            <w:tcW w:type="dxa" w:w="1920"/>
             <w:tcBorders>
               <w:top w:val="single" w:color="CCCCCC" w:sz="1"/>
               <w:left w:val="single" w:color="CCCCCC" w:sz="1"/>
@@ -5476,7 +5495,7 @@
                 <w:sz w:val="15"/>
                 <w:szCs w:val="15"/>
               </w:rPr>
-              <w:t xml:space="preserve">6.7</w:t>
+              <w:t xml:space="preserve">7.1</w:t>
             </w:r>
           </w:p>
         </w:tc>
@@ -5816,7 +5835,7 @@
                 <w:sz w:val="15"/>
                 <w:szCs w:val="15"/>
               </w:rPr>
-              <w:t xml:space="preserve">25.7</w:t>
+              <w:t xml:space="preserve">23.3</w:t>
             </w:r>
           </w:p>
         </w:tc>
@@ -6151,7 +6170,7 @@
                 <w:sz w:val="15"/>
                 <w:szCs w:val="15"/>
               </w:rPr>
-              <w:t xml:space="preserve">13.6</w:t>
+              <w:t xml:space="preserve">18.9</w:t>
             </w:r>
           </w:p>
         </w:tc>
@@ -6491,7 +6510,7 @@
                 <w:sz w:val="15"/>
                 <w:szCs w:val="15"/>
               </w:rPr>
-              <w:t xml:space="preserve">32.2</w:t>
+              <w:t xml:space="preserve">155.5</w:t>
             </w:r>
           </w:p>
         </w:tc>
@@ -6826,7 +6845,7 @@
                 <w:sz w:val="15"/>
                 <w:szCs w:val="15"/>
               </w:rPr>
-              <w:t xml:space="preserve">4,297.6</w:t>
+              <w:t xml:space="preserve">4,340.4</w:t>
             </w:r>
           </w:p>
         </w:tc>
@@ -7166,7 +7185,7 @@
                 <w:sz w:val="15"/>
                 <w:szCs w:val="15"/>
               </w:rPr>
-              <w:t xml:space="preserve">6.9</w:t>
+              <w:t xml:space="preserve">283.1</w:t>
             </w:r>
           </w:p>
         </w:tc>

</xml_diff>

<commit_message>
Report: widen N column in Tables 5/6/7 (fix 3976 wrapping); all timing/layout fixes verified in rendered PDF
</commit_message>
<xml_diff>
--- a/STUDENT_PROFESSOR_FINAL_REPORT.docx
+++ b/STUDENT_PROFESSOR_FINAL_REPORT.docx
@@ -10667,8 +10667,8 @@
         </w:tblBorders>
       </w:tblPr>
       <w:tblGrid>
-        <w:gridCol w:w="4200"/>
-        <w:gridCol w:w="480"/>
+        <w:gridCol w:w="4000"/>
+        <w:gridCol w:w="680"/>
         <w:gridCol w:w="800"/>
         <w:gridCol w:w="780"/>
         <w:gridCol w:w="700"/>
@@ -10682,7 +10682,7 @@
         </w:trPr>
         <w:tc>
           <w:tcPr>
-            <w:tcW w:type="dxa" w:w="4200"/>
+            <w:tcW w:type="dxa" w:w="4000"/>
             <w:tcBorders>
               <w:top w:val="single" w:color="CCCCCC" w:sz="1"/>
               <w:left w:val="single" w:color="CCCCCC" w:sz="1"/>
@@ -10717,7 +10717,7 @@
         </w:tc>
         <w:tc>
           <w:tcPr>
-            <w:tcW w:type="dxa" w:w="480"/>
+            <w:tcW w:type="dxa" w:w="680"/>
             <w:tcBorders>
               <w:top w:val="single" w:color="CCCCCC" w:sz="1"/>
               <w:left w:val="single" w:color="CCCCCC" w:sz="1"/>
@@ -10964,7 +10964,7 @@
       <w:tr>
         <w:tc>
           <w:tcPr>
-            <w:tcW w:type="dxa" w:w="4200"/>
+            <w:tcW w:type="dxa" w:w="4000"/>
             <w:tcBorders>
               <w:top w:val="single" w:color="CCCCCC" w:sz="1"/>
               <w:left w:val="single" w:color="CCCCCC" w:sz="1"/>
@@ -10994,7 +10994,7 @@
         </w:tc>
         <w:tc>
           <w:tcPr>
-            <w:tcW w:type="dxa" w:w="480"/>
+            <w:tcW w:type="dxa" w:w="680"/>
             <w:tcBorders>
               <w:top w:val="single" w:color="CCCCCC" w:sz="1"/>
               <w:left w:val="single" w:color="CCCCCC" w:sz="1"/>
@@ -11256,8 +11256,8 @@
         </w:tblBorders>
       </w:tblPr>
       <w:tblGrid>
-        <w:gridCol w:w="4600"/>
-        <w:gridCol w:w="520"/>
+        <w:gridCol w:w="4400"/>
+        <w:gridCol w:w="720"/>
         <w:gridCol w:w="820"/>
         <w:gridCol w:w="820"/>
         <w:gridCol w:w="820"/>
@@ -11272,7 +11272,7 @@
         </w:trPr>
         <w:tc>
           <w:tcPr>
-            <w:tcW w:type="dxa" w:w="4600"/>
+            <w:tcW w:type="dxa" w:w="4400"/>
             <w:tcBorders>
               <w:top w:val="single" w:color="CCCCCC" w:sz="1"/>
               <w:left w:val="single" w:color="CCCCCC" w:sz="1"/>
@@ -11307,7 +11307,7 @@
         </w:tc>
         <w:tc>
           <w:tcPr>
-            <w:tcW w:type="dxa" w:w="520"/>
+            <w:tcW w:type="dxa" w:w="720"/>
             <w:tcBorders>
               <w:top w:val="single" w:color="CCCCCC" w:sz="1"/>
               <w:left w:val="single" w:color="CCCCCC" w:sz="1"/>
@@ -11589,7 +11589,7 @@
       <w:tr>
         <w:tc>
           <w:tcPr>
-            <w:tcW w:type="dxa" w:w="4600"/>
+            <w:tcW w:type="dxa" w:w="4400"/>
             <w:tcBorders>
               <w:top w:val="single" w:color="CCCCCC" w:sz="1"/>
               <w:left w:val="single" w:color="CCCCCC" w:sz="1"/>
@@ -11619,7 +11619,7 @@
         </w:tc>
         <w:tc>
           <w:tcPr>
-            <w:tcW w:type="dxa" w:w="520"/>
+            <w:tcW w:type="dxa" w:w="720"/>
             <w:tcBorders>
               <w:top w:val="single" w:color="CCCCCC" w:sz="1"/>
               <w:left w:val="single" w:color="CCCCCC" w:sz="1"/>
@@ -11861,7 +11861,7 @@
       <w:tr>
         <w:tc>
           <w:tcPr>
-            <w:tcW w:type="dxa" w:w="4600"/>
+            <w:tcW w:type="dxa" w:w="4400"/>
             <w:tcBorders>
               <w:top w:val="single" w:color="CCCCCC" w:sz="1"/>
               <w:left w:val="single" w:color="CCCCCC" w:sz="1"/>
@@ -11892,7 +11892,7 @@
         </w:tc>
         <w:tc>
           <w:tcPr>
-            <w:tcW w:type="dxa" w:w="520"/>
+            <w:tcW w:type="dxa" w:w="720"/>
             <w:tcBorders>
               <w:top w:val="single" w:color="CCCCCC" w:sz="1"/>
               <w:left w:val="single" w:color="CCCCCC" w:sz="1"/>
@@ -12142,7 +12142,7 @@
       <w:tr>
         <w:tc>
           <w:tcPr>
-            <w:tcW w:type="dxa" w:w="4600"/>
+            <w:tcW w:type="dxa" w:w="4400"/>
             <w:tcBorders>
               <w:top w:val="single" w:color="CCCCCC" w:sz="1"/>
               <w:left w:val="single" w:color="CCCCCC" w:sz="1"/>
@@ -12172,7 +12172,7 @@
         </w:tc>
         <w:tc>
           <w:tcPr>
-            <w:tcW w:type="dxa" w:w="520"/>
+            <w:tcW w:type="dxa" w:w="720"/>
             <w:tcBorders>
               <w:top w:val="single" w:color="CCCCCC" w:sz="1"/>
               <w:left w:val="single" w:color="CCCCCC" w:sz="1"/>
@@ -12414,7 +12414,7 @@
       <w:tr>
         <w:tc>
           <w:tcPr>
-            <w:tcW w:type="dxa" w:w="4600"/>
+            <w:tcW w:type="dxa" w:w="4400"/>
             <w:tcBorders>
               <w:top w:val="single" w:color="CCCCCC" w:sz="1"/>
               <w:left w:val="single" w:color="CCCCCC" w:sz="1"/>
@@ -12445,7 +12445,7 @@
         </w:tc>
         <w:tc>
           <w:tcPr>
-            <w:tcW w:type="dxa" w:w="520"/>
+            <w:tcW w:type="dxa" w:w="720"/>
             <w:tcBorders>
               <w:top w:val="single" w:color="CCCCCC" w:sz="1"/>
               <w:left w:val="single" w:color="CCCCCC" w:sz="1"/>
@@ -12695,7 +12695,7 @@
       <w:tr>
         <w:tc>
           <w:tcPr>
-            <w:tcW w:type="dxa" w:w="4600"/>
+            <w:tcW w:type="dxa" w:w="4400"/>
             <w:tcBorders>
               <w:top w:val="single" w:color="CCCCCC" w:sz="1"/>
               <w:left w:val="single" w:color="CCCCCC" w:sz="1"/>
@@ -12725,7 +12725,7 @@
         </w:tc>
         <w:tc>
           <w:tcPr>
-            <w:tcW w:type="dxa" w:w="520"/>
+            <w:tcW w:type="dxa" w:w="720"/>
             <w:tcBorders>
               <w:top w:val="single" w:color="CCCCCC" w:sz="1"/>
               <w:left w:val="single" w:color="CCCCCC" w:sz="1"/>
@@ -12967,7 +12967,7 @@
       <w:tr>
         <w:tc>
           <w:tcPr>
-            <w:tcW w:type="dxa" w:w="4600"/>
+            <w:tcW w:type="dxa" w:w="4400"/>
             <w:tcBorders>
               <w:top w:val="single" w:color="CCCCCC" w:sz="1"/>
               <w:left w:val="single" w:color="CCCCCC" w:sz="1"/>
@@ -12998,7 +12998,7 @@
         </w:tc>
         <w:tc>
           <w:tcPr>
-            <w:tcW w:type="dxa" w:w="520"/>
+            <w:tcW w:type="dxa" w:w="720"/>
             <w:tcBorders>
               <w:top w:val="single" w:color="CCCCCC" w:sz="1"/>
               <w:left w:val="single" w:color="CCCCCC" w:sz="1"/>
@@ -13275,8 +13275,8 @@
         </w:tblBorders>
       </w:tblPr>
       <w:tblGrid>
-        <w:gridCol w:w="4600"/>
-        <w:gridCol w:w="520"/>
+        <w:gridCol w:w="4400"/>
+        <w:gridCol w:w="720"/>
         <w:gridCol w:w="820"/>
         <w:gridCol w:w="820"/>
         <w:gridCol w:w="820"/>
@@ -13291,7 +13291,7 @@
         </w:trPr>
         <w:tc>
           <w:tcPr>
-            <w:tcW w:type="dxa" w:w="4600"/>
+            <w:tcW w:type="dxa" w:w="4400"/>
             <w:tcBorders>
               <w:top w:val="single" w:color="CCCCCC" w:sz="1"/>
               <w:left w:val="single" w:color="CCCCCC" w:sz="1"/>
@@ -13326,7 +13326,7 @@
         </w:tc>
         <w:tc>
           <w:tcPr>
-            <w:tcW w:type="dxa" w:w="520"/>
+            <w:tcW w:type="dxa" w:w="720"/>
             <w:tcBorders>
               <w:top w:val="single" w:color="CCCCCC" w:sz="1"/>
               <w:left w:val="single" w:color="CCCCCC" w:sz="1"/>
@@ -13608,7 +13608,7 @@
       <w:tr>
         <w:tc>
           <w:tcPr>
-            <w:tcW w:type="dxa" w:w="4600"/>
+            <w:tcW w:type="dxa" w:w="4400"/>
             <w:tcBorders>
               <w:top w:val="single" w:color="CCCCCC" w:sz="1"/>
               <w:left w:val="single" w:color="CCCCCC" w:sz="1"/>
@@ -13638,7 +13638,7 @@
         </w:tc>
         <w:tc>
           <w:tcPr>
-            <w:tcW w:type="dxa" w:w="520"/>
+            <w:tcW w:type="dxa" w:w="720"/>
             <w:tcBorders>
               <w:top w:val="single" w:color="CCCCCC" w:sz="1"/>
               <w:left w:val="single" w:color="CCCCCC" w:sz="1"/>
@@ -13880,7 +13880,7 @@
       <w:tr>
         <w:tc>
           <w:tcPr>
-            <w:tcW w:type="dxa" w:w="4600"/>
+            <w:tcW w:type="dxa" w:w="4400"/>
             <w:tcBorders>
               <w:top w:val="single" w:color="CCCCCC" w:sz="1"/>
               <w:left w:val="single" w:color="CCCCCC" w:sz="1"/>
@@ -13911,7 +13911,7 @@
         </w:tc>
         <w:tc>
           <w:tcPr>
-            <w:tcW w:type="dxa" w:w="520"/>
+            <w:tcW w:type="dxa" w:w="720"/>
             <w:tcBorders>
               <w:top w:val="single" w:color="CCCCCC" w:sz="1"/>
               <w:left w:val="single" w:color="CCCCCC" w:sz="1"/>
@@ -14161,7 +14161,7 @@
       <w:tr>
         <w:tc>
           <w:tcPr>
-            <w:tcW w:type="dxa" w:w="4600"/>
+            <w:tcW w:type="dxa" w:w="4400"/>
             <w:tcBorders>
               <w:top w:val="single" w:color="CCCCCC" w:sz="1"/>
               <w:left w:val="single" w:color="CCCCCC" w:sz="1"/>
@@ -14191,7 +14191,7 @@
         </w:tc>
         <w:tc>
           <w:tcPr>
-            <w:tcW w:type="dxa" w:w="520"/>
+            <w:tcW w:type="dxa" w:w="720"/>
             <w:tcBorders>
               <w:top w:val="single" w:color="CCCCCC" w:sz="1"/>
               <w:left w:val="single" w:color="CCCCCC" w:sz="1"/>
@@ -14433,7 +14433,7 @@
       <w:tr>
         <w:tc>
           <w:tcPr>
-            <w:tcW w:type="dxa" w:w="4600"/>
+            <w:tcW w:type="dxa" w:w="4400"/>
             <w:tcBorders>
               <w:top w:val="single" w:color="CCCCCC" w:sz="1"/>
               <w:left w:val="single" w:color="CCCCCC" w:sz="1"/>
@@ -14464,7 +14464,7 @@
         </w:tc>
         <w:tc>
           <w:tcPr>
-            <w:tcW w:type="dxa" w:w="520"/>
+            <w:tcW w:type="dxa" w:w="720"/>
             <w:tcBorders>
               <w:top w:val="single" w:color="CCCCCC" w:sz="1"/>
               <w:left w:val="single" w:color="CCCCCC" w:sz="1"/>

</xml_diff>